<commit_message>
Spanish side working need to confirm English parity
</commit_message>
<xml_diff>
--- a/docassemble/PowerOfAttorneyProperty/data/templates/poa_property_bilingual.docx
+++ b/docassemble/PowerOfAttorneyProperty/data/templates/poa_property_bilingual.docx
@@ -3060,6 +3060,7 @@
                 <w:rFonts w:ascii="Verdana" w:eastAsia="Verdana" w:hAnsi="Verdana" w:cs="Verdana"/>
                 <w:i/>
                 <w:iCs/>
+                <w:strike/>
                 <w:sz w:val="24"/>
                 <w:szCs w:val="24"/>
               </w:rPr>
@@ -4492,6 +4493,13 @@
       <w:tblPr>
         <w:tblStyle w:val="TableGrid"/>
         <w:tblW w:w="0" w:type="auto"/>
+        <w:tblBorders>
+          <w:top w:val="none" w:sz="0" w:space="0" w:color="auto"/>
+          <w:left w:val="none" w:sz="0" w:space="0" w:color="auto"/>
+          <w:right w:val="none" w:sz="0" w:space="0" w:color="auto"/>
+          <w:insideH w:val="none" w:sz="0" w:space="0" w:color="auto"/>
+          <w:insideV w:val="none" w:sz="0" w:space="0" w:color="auto"/>
+        </w:tblBorders>
         <w:tblLook w:val="04A0" w:firstRow="1" w:lastRow="0" w:firstColumn="1" w:lastColumn="0" w:noHBand="0" w:noVBand="1"/>
       </w:tblPr>
       <w:tblGrid>

</xml_diff>

<commit_message>
additional updates before final internal review
</commit_message>
<xml_diff>
--- a/docassemble/PowerOfAttorneyProperty/data/templates/poa_property_bilingual.docx
+++ b/docassemble/PowerOfAttorneyProperty/data/templates/poa_property_bilingual.docx
@@ -13,7 +13,6 @@
           <w:iCs/>
           <w:sz w:val="24"/>
           <w:szCs w:val="24"/>
-          <w:u w:val="single"/>
         </w:rPr>
       </w:pPr>
       <w:commentRangeStart w:id="0"/>
@@ -27,7 +26,6 @@
           <w:bCs/>
           <w:sz w:val="24"/>
           <w:szCs w:val="24"/>
-          <w:u w:val="single"/>
         </w:rPr>
         <w:t>STATUTORY SHORT</w:t>
       </w:r>
@@ -40,7 +38,6 @@
           <w:bCs/>
           <w:sz w:val="24"/>
           <w:szCs w:val="24"/>
-          <w:u w:val="single"/>
         </w:rPr>
         <w:commentReference w:id="3"/>
       </w:r>
@@ -53,7 +50,6 @@
           <w:bCs/>
           <w:sz w:val="24"/>
           <w:szCs w:val="24"/>
-          <w:u w:val="single"/>
         </w:rPr>
         <w:commentReference w:id="2"/>
       </w:r>
@@ -66,7 +62,6 @@
           <w:bCs/>
           <w:sz w:val="24"/>
           <w:szCs w:val="24"/>
-          <w:u w:val="single"/>
         </w:rPr>
         <w:commentReference w:id="1"/>
       </w:r>
@@ -79,7 +74,6 @@
           <w:bCs/>
           <w:sz w:val="24"/>
           <w:szCs w:val="24"/>
-          <w:u w:val="single"/>
         </w:rPr>
         <w:commentReference w:id="0"/>
       </w:r>
@@ -90,7 +84,6 @@
           <w:bCs/>
           <w:sz w:val="24"/>
           <w:szCs w:val="24"/>
-          <w:u w:val="single"/>
         </w:rPr>
         <w:t xml:space="preserve"> FORM POWER OF ATTORNEY FOR PROPERTY</w:t>
       </w:r>
@@ -113,7 +106,6 @@
           <w:iCs/>
           <w:sz w:val="24"/>
           <w:szCs w:val="24"/>
-          <w:u w:val="single"/>
         </w:rPr>
       </w:pPr>
       <w:r>
@@ -125,7 +117,6 @@
           <w:iCs/>
           <w:sz w:val="24"/>
           <w:szCs w:val="24"/>
-          <w:u w:val="single"/>
         </w:rPr>
         <w:t xml:space="preserve">FORMULARIO DE PODER NOTARIAL ESTATUTARIO ABREVIADO DE ILLINOIS PARA ASUNTOS DE PROPIEDAD </w:t>
       </w:r>
@@ -677,39 +668,146 @@
                 <w:sz w:val="24"/>
                 <w:szCs w:val="24"/>
               </w:rPr>
-              <w:t>The powers you give your agent are explained more fully in Section 3-4 of the Illinois Power of Attorney Act. This form is a part of that law. The "NOTE" paragraphs throughout this form are instructions.</w:t>
-            </w:r>
-          </w:p>
-        </w:tc>
-        <w:tc>
-          <w:tcPr>
-            <w:tcW w:w="4680" w:type="dxa"/>
-            <w:tcMar>
-              <w:top w:w="100" w:type="dxa"/>
-              <w:left w:w="100" w:type="dxa"/>
-              <w:bottom w:w="100" w:type="dxa"/>
-              <w:right w:w="100" w:type="dxa"/>
-            </w:tcMar>
-          </w:tcPr>
-          <w:p>
-            <w:pPr>
-              <w:rPr>
-                <w:rFonts w:ascii="Verdana" w:eastAsia="Verdana" w:hAnsi="Verdana" w:cs="Verdana"/>
-                <w:i/>
-                <w:iCs/>
-                <w:sz w:val="24"/>
-                <w:szCs w:val="24"/>
-              </w:rPr>
-            </w:pPr>
-            <w:r>
-              <w:rPr>
-                <w:rFonts w:ascii="Verdana" w:eastAsia="Verdana" w:hAnsi="Verdana" w:cs="Verdana"/>
-                <w:i/>
-                <w:iCs/>
-                <w:sz w:val="24"/>
-                <w:szCs w:val="24"/>
-              </w:rPr>
-              <w:t>Los poderes que usted otorga a su agente se explican con más detalle en la sección 3-4 de la Ley de Poderes Notariales de Illinois. Este formulario forma parte de dicha ley. Los párrafos “NOTA” que aparecen a lo largo de este formulario son instrucciones.</w:t>
+              <w:t>The powers you give your agent are explained more fully in Section 3-4 of the Illinois Power of Attorney Act. This form is a part of that law.</w:t>
+            </w:r>
+          </w:p>
+          <w:p>
+            <w:pPr>
+              <w:rPr>
+                <w:rFonts w:ascii="Verdana" w:eastAsia="Verdana" w:hAnsi="Verdana" w:cs="Verdana"/>
+                <w:sz w:val="24"/>
+                <w:szCs w:val="24"/>
+              </w:rPr>
+            </w:pPr>
+          </w:p>
+          <w:p>
+            <w:pPr>
+              <w:rPr>
+                <w:rFonts w:ascii="Verdana" w:eastAsia="Verdana" w:hAnsi="Verdana" w:cs="Verdana"/>
+                <w:sz w:val="24"/>
+                <w:szCs w:val="24"/>
+              </w:rPr>
+            </w:pPr>
+          </w:p>
+          <w:p>
+            <w:pPr>
+              <w:rPr>
+                <w:rFonts w:ascii="Verdana" w:eastAsia="Verdana" w:hAnsi="Verdana" w:cs="Verdana"/>
+                <w:sz w:val="24"/>
+                <w:szCs w:val="24"/>
+              </w:rPr>
+            </w:pPr>
+            <w:r>
+              <w:rPr>
+                <w:rFonts w:ascii="Verdana" w:eastAsia="Verdana" w:hAnsi="Verdana" w:cs="Verdana"/>
+                <w:sz w:val="24"/>
+                <w:szCs w:val="24"/>
+              </w:rPr>
+              <w:t>The "</w:t>
+            </w:r>
+            <w:r>
+              <w:rPr>
+                <w:rFonts w:ascii="Verdana" w:eastAsia="Verdana" w:hAnsi="Verdana" w:cs="Verdana"/>
+                <w:b/>
+                <w:bCs/>
+                <w:sz w:val="24"/>
+                <w:szCs w:val="24"/>
+              </w:rPr>
+              <w:t>NOTE</w:t>
+            </w:r>
+            <w:r>
+              <w:rPr>
+                <w:rFonts w:ascii="Verdana" w:eastAsia="Verdana" w:hAnsi="Verdana" w:cs="Verdana"/>
+                <w:sz w:val="24"/>
+                <w:szCs w:val="24"/>
+              </w:rPr>
+              <w:t>" paragraphs throughout this form are instructions.</w:t>
+            </w:r>
+          </w:p>
+        </w:tc>
+        <w:tc>
+          <w:tcPr>
+            <w:tcW w:w="4680" w:type="dxa"/>
+            <w:tcMar>
+              <w:top w:w="100" w:type="dxa"/>
+              <w:left w:w="100" w:type="dxa"/>
+              <w:bottom w:w="100" w:type="dxa"/>
+              <w:right w:w="100" w:type="dxa"/>
+            </w:tcMar>
+          </w:tcPr>
+          <w:p>
+            <w:pPr>
+              <w:rPr>
+                <w:rFonts w:ascii="Verdana" w:eastAsia="Verdana" w:hAnsi="Verdana" w:cs="Verdana"/>
+                <w:i/>
+                <w:iCs/>
+                <w:sz w:val="24"/>
+                <w:szCs w:val="24"/>
+              </w:rPr>
+            </w:pPr>
+            <w:r>
+              <w:rPr>
+                <w:rFonts w:ascii="Verdana" w:eastAsia="Verdana" w:hAnsi="Verdana" w:cs="Verdana"/>
+                <w:i/>
+                <w:iCs/>
+                <w:sz w:val="24"/>
+                <w:szCs w:val="24"/>
+              </w:rPr>
+              <w:t xml:space="preserve">Los poderes que usted otorga a su agente se explican con más detalle en la sección 3-4 de la Ley de Poderes Notariales de Illinois. Este formulario forma parte de dicha ley. </w:t>
+            </w:r>
+          </w:p>
+          <w:p>
+            <w:pPr>
+              <w:rPr>
+                <w:rFonts w:ascii="Verdana" w:eastAsia="Verdana" w:hAnsi="Verdana" w:cs="Verdana"/>
+                <w:i/>
+                <w:iCs/>
+                <w:sz w:val="24"/>
+                <w:szCs w:val="24"/>
+              </w:rPr>
+            </w:pPr>
+          </w:p>
+          <w:p>
+            <w:pPr>
+              <w:rPr>
+                <w:rFonts w:ascii="Verdana" w:eastAsia="Verdana" w:hAnsi="Verdana" w:cs="Verdana"/>
+                <w:i/>
+                <w:iCs/>
+                <w:sz w:val="24"/>
+                <w:szCs w:val="24"/>
+              </w:rPr>
+            </w:pPr>
+            <w:r>
+              <w:rPr>
+                <w:rFonts w:ascii="Verdana" w:eastAsia="Verdana" w:hAnsi="Verdana" w:cs="Verdana"/>
+                <w:i/>
+                <w:iCs/>
+                <w:sz w:val="24"/>
+                <w:szCs w:val="24"/>
+              </w:rPr>
+              <w:t>Los párrafos “</w:t>
+            </w:r>
+            <w:r>
+              <w:rPr>
+                <w:rFonts w:ascii="Verdana" w:eastAsia="Verdana" w:hAnsi="Verdana" w:cs="Verdana"/>
+                <w:b/>
+                <w:bCs/>
+                <w:i/>
+                <w:iCs/>
+                <w:sz w:val="24"/>
+                <w:szCs w:val="24"/>
+              </w:rPr>
+              <w:t>NOTA</w:t>
+            </w:r>
+            <w:r>
+              <w:rPr>
+                <w:rFonts w:ascii="Verdana" w:eastAsia="Verdana" w:hAnsi="Verdana" w:cs="Verdana"/>
+                <w:i/>
+                <w:iCs/>
+                <w:sz w:val="24"/>
+                <w:szCs w:val="24"/>
+              </w:rPr>
+              <w:t>” que aparecen a lo largo de este formulario son instrucciones.</w:t>
             </w:r>
           </w:p>
         </w:tc>
@@ -849,7 +947,12 @@
           <w:szCs w:val="24"/>
         </w:rPr>
         <w:sectPr>
-          <w:footerReference w:type="default" r:id="rId10"/>
+          <w:headerReference w:type="even" r:id="rId10"/>
+          <w:headerReference w:type="default" r:id="rId11"/>
+          <w:footerReference w:type="even" r:id="rId12"/>
+          <w:footerReference w:type="default" r:id="rId13"/>
+          <w:headerReference w:type="first" r:id="rId14"/>
+          <w:footerReference w:type="first" r:id="rId15"/>
           <w:pgSz w:w="12240" w:h="15840"/>
           <w:pgMar w:top="1152" w:right="1440" w:bottom="1152" w:left="1440" w:header="720" w:footer="720" w:gutter="0"/>
           <w:pgNumType w:start="1"/>
@@ -930,7 +1033,6 @@
     </w:p>
     <w:p>
       <w:pPr>
-        <w:jc w:val="center"/>
         <w:rPr>
           <w:rFonts w:ascii="Verdana" w:eastAsia="Verdana" w:hAnsi="Verdana" w:cs="Verdana"/>
           <w:b/>
@@ -949,7 +1051,7 @@
           <w:szCs w:val="24"/>
           <w:u w:val="single"/>
         </w:rPr>
-        <w:t xml:space="preserve">ILLINOIS STATUTORY SHORT FORM POWER OF ATTORNEY </w:t>
+        <w:br w:type="page"/>
       </w:r>
     </w:p>
     <w:p>
@@ -961,7 +1063,6 @@
           <w:bCs/>
           <w:sz w:val="24"/>
           <w:szCs w:val="24"/>
-          <w:u w:val="single"/>
         </w:rPr>
       </w:pPr>
       <w:r>
@@ -971,9 +1072,9 @@
           <w:bCs/>
           <w:sz w:val="24"/>
           <w:szCs w:val="24"/>
-          <w:u w:val="single"/>
-        </w:rPr>
-        <w:t>FOR PROPERTY</w:t>
+        </w:rPr>
+        <w:lastRenderedPageBreak/>
+        <w:t xml:space="preserve">ILLINOIS STATUTORY SHORT FORM POWER OF ATTORNEY </w:t>
       </w:r>
     </w:p>
     <w:p>
@@ -985,18 +1086,6 @@
           <w:bCs/>
           <w:sz w:val="24"/>
           <w:szCs w:val="24"/>
-          <w:u w:val="single"/>
-        </w:rPr>
-      </w:pPr>
-    </w:p>
-    <w:p>
-      <w:pPr>
-        <w:jc w:val="center"/>
-        <w:rPr>
-          <w:rFonts w:ascii="Verdana" w:eastAsia="Verdana" w:hAnsi="Verdana" w:cs="Verdana"/>
-          <w:sz w:val="24"/>
-          <w:szCs w:val="24"/>
-          <w:u w:val="single"/>
         </w:rPr>
       </w:pPr>
       <w:r>
@@ -1006,7 +1095,38 @@
           <w:bCs/>
           <w:sz w:val="24"/>
           <w:szCs w:val="24"/>
-          <w:u w:val="single"/>
+        </w:rPr>
+        <w:t>FOR PROPERTY</w:t>
+      </w:r>
+    </w:p>
+    <w:p>
+      <w:pPr>
+        <w:jc w:val="center"/>
+        <w:rPr>
+          <w:rFonts w:ascii="Verdana" w:eastAsia="Verdana" w:hAnsi="Verdana" w:cs="Verdana"/>
+          <w:b/>
+          <w:bCs/>
+          <w:sz w:val="24"/>
+          <w:szCs w:val="24"/>
+        </w:rPr>
+      </w:pPr>
+    </w:p>
+    <w:p>
+      <w:pPr>
+        <w:jc w:val="center"/>
+        <w:rPr>
+          <w:rFonts w:ascii="Verdana" w:eastAsia="Verdana" w:hAnsi="Verdana" w:cs="Verdana"/>
+          <w:sz w:val="24"/>
+          <w:szCs w:val="24"/>
+        </w:rPr>
+      </w:pPr>
+      <w:r>
+        <w:rPr>
+          <w:rFonts w:ascii="Verdana" w:eastAsia="Verdana" w:hAnsi="Verdana" w:cs="Verdana"/>
+          <w:b/>
+          <w:bCs/>
+          <w:sz w:val="24"/>
+          <w:szCs w:val="24"/>
         </w:rPr>
         <w:t>FORMULARIO DE PODER NOTARIAL ESTATUTARIO ABREVIADO DE ILLINOIS PARA ASUNTOS DE PROPIEDAD</w:t>
       </w:r>
@@ -1015,7 +1135,6 @@
           <w:rFonts w:ascii="Verdana" w:eastAsia="Verdana" w:hAnsi="Verdana" w:cs="Verdana"/>
           <w:sz w:val="24"/>
           <w:szCs w:val="24"/>
-          <w:u w:val="single"/>
         </w:rPr>
         <w:t xml:space="preserve"> </w:t>
       </w:r>
@@ -1387,37 +1506,77 @@
                 <w:sz w:val="24"/>
                 <w:szCs w:val="24"/>
               </w:rPr>
-              <w:t xml:space="preserve">(NOTE: You may not name co-agents using this form.) </w:t>
-            </w:r>
-          </w:p>
-        </w:tc>
-        <w:tc>
-          <w:tcPr>
-            <w:tcW w:w="4680" w:type="dxa"/>
-            <w:tcMar>
-              <w:top w:w="100" w:type="dxa"/>
-              <w:left w:w="100" w:type="dxa"/>
-              <w:bottom w:w="100" w:type="dxa"/>
-              <w:right w:w="100" w:type="dxa"/>
-            </w:tcMar>
-          </w:tcPr>
-          <w:p>
-            <w:pPr>
-              <w:rPr>
-                <w:rFonts w:ascii="Verdana" w:eastAsia="Verdana" w:hAnsi="Verdana" w:cs="Verdana"/>
-                <w:sz w:val="24"/>
-                <w:szCs w:val="24"/>
-              </w:rPr>
-            </w:pPr>
-            <w:r>
-              <w:rPr>
-                <w:rFonts w:ascii="Verdana" w:eastAsia="Verdana" w:hAnsi="Verdana" w:cs="Verdana"/>
-                <w:i/>
-                <w:iCs/>
-                <w:sz w:val="24"/>
-                <w:szCs w:val="24"/>
-              </w:rPr>
-              <w:t>(NOTA: No puede designar coagentes utilizando este formulario.)</w:t>
+              <w:t>(</w:t>
+            </w:r>
+            <w:r>
+              <w:rPr>
+                <w:rFonts w:ascii="Verdana" w:eastAsia="Verdana" w:hAnsi="Verdana" w:cs="Verdana"/>
+                <w:b/>
+                <w:bCs/>
+                <w:sz w:val="24"/>
+                <w:szCs w:val="24"/>
+              </w:rPr>
+              <w:t>NOTE</w:t>
+            </w:r>
+            <w:r>
+              <w:rPr>
+                <w:rFonts w:ascii="Verdana" w:eastAsia="Verdana" w:hAnsi="Verdana" w:cs="Verdana"/>
+                <w:sz w:val="24"/>
+                <w:szCs w:val="24"/>
+              </w:rPr>
+              <w:t xml:space="preserve">: You may not name co-agents using this form.) </w:t>
+            </w:r>
+          </w:p>
+        </w:tc>
+        <w:tc>
+          <w:tcPr>
+            <w:tcW w:w="4680" w:type="dxa"/>
+            <w:tcMar>
+              <w:top w:w="100" w:type="dxa"/>
+              <w:left w:w="100" w:type="dxa"/>
+              <w:bottom w:w="100" w:type="dxa"/>
+              <w:right w:w="100" w:type="dxa"/>
+            </w:tcMar>
+          </w:tcPr>
+          <w:p>
+            <w:pPr>
+              <w:rPr>
+                <w:rFonts w:ascii="Verdana" w:eastAsia="Verdana" w:hAnsi="Verdana" w:cs="Verdana"/>
+                <w:sz w:val="24"/>
+                <w:szCs w:val="24"/>
+              </w:rPr>
+            </w:pPr>
+            <w:r>
+              <w:rPr>
+                <w:rFonts w:ascii="Verdana" w:eastAsia="Verdana" w:hAnsi="Verdana" w:cs="Verdana"/>
+                <w:i/>
+                <w:iCs/>
+                <w:sz w:val="24"/>
+                <w:szCs w:val="24"/>
+              </w:rPr>
+              <w:t>(</w:t>
+            </w:r>
+            <w:r>
+              <w:rPr>
+                <w:rFonts w:ascii="Verdana" w:eastAsia="Verdana" w:hAnsi="Verdana" w:cs="Verdana"/>
+                <w:b/>
+                <w:bCs/>
+                <w:i/>
+                <w:iCs/>
+                <w:sz w:val="24"/>
+                <w:szCs w:val="24"/>
+              </w:rPr>
+              <w:t>NOTA</w:t>
+            </w:r>
+            <w:r>
+              <w:rPr>
+                <w:rFonts w:ascii="Verdana" w:eastAsia="Verdana" w:hAnsi="Verdana" w:cs="Verdana"/>
+                <w:i/>
+                <w:iCs/>
+                <w:sz w:val="24"/>
+                <w:szCs w:val="24"/>
+              </w:rPr>
+              <w:t>: No puede designar coagentes utilizando este formulario.)</w:t>
             </w:r>
           </w:p>
         </w:tc>
@@ -1447,7 +1606,7 @@
                 <w:sz w:val="24"/>
                 <w:szCs w:val="24"/>
               </w:rPr>
-              <w:t xml:space="preserve">as my attorney-in-fact (my "agent") to act for me and in my name (in any way I could act in person) with respect to the following powers, as defined in Section 3-4 of the "Statutory Short Form Power of Attorney for Property Law" </w:t>
+              <w:t xml:space="preserve">as my attorney-in-fact (my "agent") to act for me and in my name (in any way I could act in person) with respect to the following powers, as defined in Section 3-4 of the </w:t>
             </w:r>
             <w:r>
               <w:rPr>
@@ -1456,7 +1615,7 @@
                 <w:szCs w:val="24"/>
               </w:rPr>
               <w:lastRenderedPageBreak/>
-              <w:t>(including all amendments), but subject to any limitations on or additions to the specified powers inserted in paragraph 2 or 3 below:</w:t>
+              <w:t>"Statutory Short Form Power of Attorney for Property Law" (including all amendments), but subject to any limitations on or additions to the specified powers inserted in paragraph 2 or 3 below:</w:t>
             </w:r>
           </w:p>
         </w:tc>
@@ -1489,7 +1648,7 @@
                 <w:szCs w:val="24"/>
               </w:rPr>
               <w:lastRenderedPageBreak/>
-              <w:t xml:space="preserve">como mi apoderado (mi “agente”) para que actúe por mí y en mi nombre  (de la misma manera que yo podría actuar personalmente) con respecto a los siguientes poderes, tal y como se definen en la sección 3-4 de la Ley del Formulario de </w:t>
+              <w:t xml:space="preserve">como mi apoderado (mi “agente”) para que actúe por mí y en mi nombre  (de la misma manera que yo podría actuar personalmente) con respecto a los siguientes poderes, </w:t>
             </w:r>
             <w:r>
               <w:rPr>
@@ -1500,7 +1659,7 @@
                 <w:szCs w:val="24"/>
               </w:rPr>
               <w:lastRenderedPageBreak/>
-              <w:t>Poder Notarial Estatutario Abreviado para Asuntos de Propiedad (incluidas todas las enmiendas)</w:t>
+              <w:t>tal y como se definen en la sección 3-4 de la Ley del Formulario de Poder Notarial Estatutario Abreviado para Asuntos de Propiedad (incluidas todas las enmiendas)</w:t>
             </w:r>
             <w:r>
               <w:rPr>
@@ -1568,40 +1727,79 @@
                 <w:sz w:val="24"/>
                 <w:szCs w:val="24"/>
               </w:rPr>
-              <w:lastRenderedPageBreak/>
-              <w:t>(NOTE: You must strike out any one or more of the following categories of powers you do not want your agent to have. Failure to strike the title of any category will cause the powers described in that category to be granted to the agent. To strike out a category you must draw a line through the title of that category.)</w:t>
-            </w:r>
-          </w:p>
-        </w:tc>
-        <w:tc>
-          <w:tcPr>
-            <w:tcW w:w="4680" w:type="dxa"/>
-            <w:tcMar>
-              <w:top w:w="100" w:type="dxa"/>
-              <w:left w:w="100" w:type="dxa"/>
-              <w:bottom w:w="100" w:type="dxa"/>
-              <w:right w:w="100" w:type="dxa"/>
-            </w:tcMar>
-          </w:tcPr>
-          <w:p>
-            <w:pPr>
-              <w:rPr>
-                <w:rFonts w:ascii="Verdana" w:eastAsia="Verdana" w:hAnsi="Verdana" w:cs="Verdana"/>
-                <w:i/>
-                <w:iCs/>
-                <w:sz w:val="24"/>
-                <w:szCs w:val="24"/>
-              </w:rPr>
-            </w:pPr>
-            <w:r>
-              <w:rPr>
-                <w:rFonts w:ascii="Verdana" w:eastAsia="Verdana" w:hAnsi="Verdana" w:cs="Verdana"/>
-                <w:i/>
-                <w:iCs/>
-                <w:sz w:val="24"/>
-                <w:szCs w:val="24"/>
-              </w:rPr>
-              <w:t>(NOTA: Debe tachar cualquiera de las siguientes categorías de facultades que no desee que tenga su agente. Si no tacha el título de alguna categoría, las facultades descritas en dicha categoría se otorgarán al agente. Para tachar una categoría, debe trazar una línea sobre el título de dicha categoría).</w:t>
+              <w:t>(</w:t>
+            </w:r>
+            <w:r>
+              <w:rPr>
+                <w:rFonts w:ascii="Verdana" w:eastAsia="Verdana" w:hAnsi="Verdana" w:cs="Verdana"/>
+                <w:b/>
+                <w:bCs/>
+                <w:sz w:val="24"/>
+                <w:szCs w:val="24"/>
+              </w:rPr>
+              <w:t>NOTE</w:t>
+            </w:r>
+            <w:r>
+              <w:rPr>
+                <w:rFonts w:ascii="Verdana" w:eastAsia="Verdana" w:hAnsi="Verdana" w:cs="Verdana"/>
+                <w:sz w:val="24"/>
+                <w:szCs w:val="24"/>
+              </w:rPr>
+              <w:t>: You must strike out any one or more of the following categories of powers you do not want your agent to have. Failure to strike the title of any category will cause the powers described in that category to be granted to the agent. To strike out a category you must draw a line through the title of that category.)</w:t>
+            </w:r>
+          </w:p>
+        </w:tc>
+        <w:tc>
+          <w:tcPr>
+            <w:tcW w:w="4680" w:type="dxa"/>
+            <w:tcMar>
+              <w:top w:w="100" w:type="dxa"/>
+              <w:left w:w="100" w:type="dxa"/>
+              <w:bottom w:w="100" w:type="dxa"/>
+              <w:right w:w="100" w:type="dxa"/>
+            </w:tcMar>
+          </w:tcPr>
+          <w:p>
+            <w:pPr>
+              <w:rPr>
+                <w:rFonts w:ascii="Verdana" w:eastAsia="Verdana" w:hAnsi="Verdana" w:cs="Verdana"/>
+                <w:i/>
+                <w:iCs/>
+                <w:sz w:val="24"/>
+                <w:szCs w:val="24"/>
+              </w:rPr>
+            </w:pPr>
+            <w:r>
+              <w:rPr>
+                <w:rFonts w:ascii="Verdana" w:eastAsia="Verdana" w:hAnsi="Verdana" w:cs="Verdana"/>
+                <w:i/>
+                <w:iCs/>
+                <w:sz w:val="24"/>
+                <w:szCs w:val="24"/>
+              </w:rPr>
+              <w:t>(</w:t>
+            </w:r>
+            <w:r>
+              <w:rPr>
+                <w:rFonts w:ascii="Verdana" w:eastAsia="Verdana" w:hAnsi="Verdana" w:cs="Verdana"/>
+                <w:b/>
+                <w:bCs/>
+                <w:i/>
+                <w:iCs/>
+                <w:sz w:val="24"/>
+                <w:szCs w:val="24"/>
+              </w:rPr>
+              <w:t>NOTA</w:t>
+            </w:r>
+            <w:r>
+              <w:rPr>
+                <w:rFonts w:ascii="Verdana" w:eastAsia="Verdana" w:hAnsi="Verdana" w:cs="Verdana"/>
+                <w:i/>
+                <w:iCs/>
+                <w:sz w:val="24"/>
+                <w:szCs w:val="24"/>
+              </w:rPr>
+              <w:t>: Debe tachar cualquiera de las siguientes categorías de facultades que no desee que tenga su agente. Si no tacha el título de alguna categoría, las facultades descritas en dicha categoría se otorgarán al agente. Para tachar una categoría, debe trazar una línea sobre el título de dicha categoría).</w:t>
             </w:r>
           </w:p>
         </w:tc>
@@ -2096,7 +2294,17 @@
                 <w:sz w:val="24"/>
                 <w:szCs w:val="24"/>
               </w:rPr>
-              <w:t>Tangible personal property transactions.</w:t>
+              <w:t xml:space="preserve">Tangible </w:t>
+            </w:r>
+            <w:r>
+              <w:rPr>
+                <w:rFonts w:ascii="Verdana" w:eastAsia="Verdana" w:hAnsi="Verdana" w:cs="Verdana"/>
+                <w:strike/>
+                <w:sz w:val="24"/>
+                <w:szCs w:val="24"/>
+              </w:rPr>
+              <w:lastRenderedPageBreak/>
+              <w:t>personal property transactions.</w:t>
             </w:r>
             <w:r>
               <w:rPr>
@@ -2136,6 +2344,7 @@
                 <w:sz w:val="24"/>
                 <w:szCs w:val="24"/>
               </w:rPr>
+              <w:lastRenderedPageBreak/>
               <w:t xml:space="preserve">(d) </w:t>
             </w:r>
             <w:r>
@@ -2166,7 +2375,18 @@
                 <w:sz w:val="24"/>
                 <w:szCs w:val="24"/>
               </w:rPr>
-              <w:t>{% else %}</w:t>
+              <w:t xml:space="preserve">{% else </w:t>
+            </w:r>
+            <w:r>
+              <w:rPr>
+                <w:rFonts w:ascii="Verdana" w:eastAsia="Verdana" w:hAnsi="Verdana" w:cs="Verdana"/>
+                <w:i/>
+                <w:iCs/>
+                <w:sz w:val="24"/>
+                <w:szCs w:val="24"/>
+              </w:rPr>
+              <w:lastRenderedPageBreak/>
+              <w:t>%}</w:t>
             </w:r>
             <w:r>
               <w:rPr>
@@ -2217,7 +2437,6 @@
                 <w:sz w:val="24"/>
                 <w:szCs w:val="24"/>
               </w:rPr>
-              <w:lastRenderedPageBreak/>
               <w:t>(e)</w:t>
             </w:r>
             <w:r>
@@ -3129,7 +3348,17 @@
                 <w:sz w:val="24"/>
                 <w:szCs w:val="24"/>
               </w:rPr>
-              <w:t>Commodity and option transactions.</w:t>
+              <w:t xml:space="preserve">Commodity </w:t>
+            </w:r>
+            <w:r>
+              <w:rPr>
+                <w:rFonts w:ascii="Verdana" w:eastAsia="Verdana" w:hAnsi="Verdana" w:cs="Verdana"/>
+                <w:strike/>
+                <w:sz w:val="24"/>
+                <w:szCs w:val="24"/>
+              </w:rPr>
+              <w:lastRenderedPageBreak/>
+              <w:t>and option transactions.</w:t>
             </w:r>
             <w:r>
               <w:rPr>
@@ -3169,6 +3398,7 @@
                 <w:sz w:val="24"/>
                 <w:szCs w:val="24"/>
               </w:rPr>
+              <w:lastRenderedPageBreak/>
               <w:t>(k)</w:t>
             </w:r>
             <w:r>
@@ -3209,7 +3439,18 @@
                 <w:sz w:val="24"/>
                 <w:szCs w:val="24"/>
               </w:rPr>
-              <w:t>{% else %}</w:t>
+              <w:t xml:space="preserve">{% else </w:t>
+            </w:r>
+            <w:r>
+              <w:rPr>
+                <w:rFonts w:ascii="Verdana" w:eastAsia="Verdana" w:hAnsi="Verdana" w:cs="Verdana"/>
+                <w:i/>
+                <w:iCs/>
+                <w:sz w:val="24"/>
+                <w:szCs w:val="24"/>
+              </w:rPr>
+              <w:lastRenderedPageBreak/>
+              <w:t>%}</w:t>
             </w:r>
             <w:r>
               <w:rPr>
@@ -3260,7 +3501,6 @@
                 <w:sz w:val="24"/>
                 <w:szCs w:val="24"/>
               </w:rPr>
-              <w:lastRenderedPageBreak/>
               <w:t>(l)</w:t>
             </w:r>
             <w:r>
@@ -3896,39 +4136,79 @@
                 <w:sz w:val="24"/>
                 <w:szCs w:val="24"/>
               </w:rPr>
-              <w:t>(NOTE: Limitations on and additions to the agent's powers may be included in this power of attorney if they are specifically described below.)</w:t>
-            </w:r>
-          </w:p>
-        </w:tc>
-        <w:tc>
-          <w:tcPr>
-            <w:tcW w:w="4680" w:type="dxa"/>
-            <w:tcMar>
-              <w:top w:w="100" w:type="dxa"/>
-              <w:left w:w="100" w:type="dxa"/>
-              <w:bottom w:w="100" w:type="dxa"/>
-              <w:right w:w="100" w:type="dxa"/>
-            </w:tcMar>
-          </w:tcPr>
-          <w:p>
-            <w:pPr>
-              <w:rPr>
-                <w:rFonts w:ascii="Verdana" w:eastAsia="Verdana" w:hAnsi="Verdana" w:cs="Verdana"/>
-                <w:i/>
-                <w:iCs/>
-                <w:sz w:val="24"/>
-                <w:szCs w:val="24"/>
-              </w:rPr>
-            </w:pPr>
-            <w:r>
-              <w:rPr>
-                <w:rFonts w:ascii="Verdana" w:eastAsia="Verdana" w:hAnsi="Verdana" w:cs="Verdana"/>
-                <w:i/>
-                <w:iCs/>
-                <w:sz w:val="24"/>
-                <w:szCs w:val="24"/>
-              </w:rPr>
-              <w:t>(NOTA: Este poder notarial puede incluir limitaciones o adiciones a las facultades del agente, siempre que se describan específicamente a continuación.)</w:t>
+              <w:t>(</w:t>
+            </w:r>
+            <w:r>
+              <w:rPr>
+                <w:rFonts w:ascii="Verdana" w:eastAsia="Verdana" w:hAnsi="Verdana" w:cs="Verdana"/>
+                <w:b/>
+                <w:bCs/>
+                <w:sz w:val="24"/>
+                <w:szCs w:val="24"/>
+              </w:rPr>
+              <w:t>NOTE</w:t>
+            </w:r>
+            <w:r>
+              <w:rPr>
+                <w:rFonts w:ascii="Verdana" w:eastAsia="Verdana" w:hAnsi="Verdana" w:cs="Verdana"/>
+                <w:sz w:val="24"/>
+                <w:szCs w:val="24"/>
+              </w:rPr>
+              <w:t>: Limitations on and additions to the agent's powers may be included in this power of attorney if they are specifically described below.)</w:t>
+            </w:r>
+          </w:p>
+        </w:tc>
+        <w:tc>
+          <w:tcPr>
+            <w:tcW w:w="4680" w:type="dxa"/>
+            <w:tcMar>
+              <w:top w:w="100" w:type="dxa"/>
+              <w:left w:w="100" w:type="dxa"/>
+              <w:bottom w:w="100" w:type="dxa"/>
+              <w:right w:w="100" w:type="dxa"/>
+            </w:tcMar>
+          </w:tcPr>
+          <w:p>
+            <w:pPr>
+              <w:rPr>
+                <w:rFonts w:ascii="Verdana" w:eastAsia="Verdana" w:hAnsi="Verdana" w:cs="Verdana"/>
+                <w:i/>
+                <w:iCs/>
+                <w:sz w:val="24"/>
+                <w:szCs w:val="24"/>
+              </w:rPr>
+            </w:pPr>
+            <w:r>
+              <w:rPr>
+                <w:rFonts w:ascii="Verdana" w:eastAsia="Verdana" w:hAnsi="Verdana" w:cs="Verdana"/>
+                <w:i/>
+                <w:iCs/>
+                <w:sz w:val="24"/>
+                <w:szCs w:val="24"/>
+              </w:rPr>
+              <w:t>(</w:t>
+            </w:r>
+            <w:r>
+              <w:rPr>
+                <w:rFonts w:ascii="Verdana" w:eastAsia="Verdana" w:hAnsi="Verdana" w:cs="Verdana"/>
+                <w:b/>
+                <w:bCs/>
+                <w:i/>
+                <w:iCs/>
+                <w:sz w:val="24"/>
+                <w:szCs w:val="24"/>
+              </w:rPr>
+              <w:t>NOTA</w:t>
+            </w:r>
+            <w:r>
+              <w:rPr>
+                <w:rFonts w:ascii="Verdana" w:eastAsia="Verdana" w:hAnsi="Verdana" w:cs="Verdana"/>
+                <w:i/>
+                <w:iCs/>
+                <w:sz w:val="24"/>
+                <w:szCs w:val="24"/>
+              </w:rPr>
+              <w:t>: Este poder notarial puede incluir limitaciones o adiciones a las facultades del agente, siempre que se describan específicamente a continuación.)</w:t>
             </w:r>
           </w:p>
         </w:tc>
@@ -4042,31 +4322,9 @@
                 <w:sz w:val="24"/>
                 <w:szCs w:val="24"/>
               </w:rPr>
-              <w:t xml:space="preserve">(NOTE: Here you may include any specific limitations you deem appropriate, such as a prohibition or conditions on the sale of particular </w:t>
-            </w:r>
-            <w:r>
-              <w:rPr>
-                <w:rFonts w:ascii="Verdana" w:eastAsia="Verdana" w:hAnsi="Verdana" w:cs="Verdana"/>
-                <w:sz w:val="24"/>
-                <w:szCs w:val="24"/>
-              </w:rPr>
-              <w:lastRenderedPageBreak/>
-              <w:t>stock or real estate or special rules on borrowing by the agent.)</w:t>
-            </w:r>
-          </w:p>
-        </w:tc>
-        <w:tc>
-          <w:tcPr>
-            <w:tcW w:w="4680" w:type="dxa"/>
-            <w:tcMar>
-              <w:top w:w="100" w:type="dxa"/>
-              <w:left w:w="100" w:type="dxa"/>
-              <w:bottom w:w="100" w:type="dxa"/>
-              <w:right w:w="100" w:type="dxa"/>
-            </w:tcMar>
-          </w:tcPr>
-          <w:p>
-            <w:pPr>
+              <w:t>(</w:t>
+            </w:r>
+            <w:r>
               <w:rPr>
                 <w:rFonts w:ascii="Verdana" w:eastAsia="Verdana" w:hAnsi="Verdana" w:cs="Verdana"/>
                 <w:b/>
@@ -4074,18 +4332,47 @@
                 <w:sz w:val="24"/>
                 <w:szCs w:val="24"/>
               </w:rPr>
-            </w:pPr>
-            <w:r>
-              <w:rPr>
-                <w:rFonts w:ascii="Verdana" w:eastAsia="Verdana" w:hAnsi="Verdana" w:cs="Verdana"/>
-                <w:i/>
-                <w:iCs/>
+              <w:t>NOTE</w:t>
+            </w:r>
+            <w:r>
+              <w:rPr>
+                <w:rFonts w:ascii="Verdana" w:eastAsia="Verdana" w:hAnsi="Verdana" w:cs="Verdana"/>
+                <w:sz w:val="24"/>
+                <w:szCs w:val="24"/>
+              </w:rPr>
+              <w:t xml:space="preserve">: Here you may include any specific limitations you deem appropriate, such as a prohibition or </w:t>
+            </w:r>
+            <w:r>
+              <w:rPr>
+                <w:rFonts w:ascii="Verdana" w:eastAsia="Verdana" w:hAnsi="Verdana" w:cs="Verdana"/>
                 <w:sz w:val="24"/>
                 <w:szCs w:val="24"/>
               </w:rPr>
               <w:lastRenderedPageBreak/>
-              <w:t xml:space="preserve">(NOTA: Aquí puede incluir cualquier limitación específica que considere apropiada, como la prohibición o las condiciones para la venta de determinadas acciones o bienes o </w:t>
-            </w:r>
+              <w:t>conditions on the sale of particular stock or real estate or special rules on borrowing by the agent.)</w:t>
+            </w:r>
+          </w:p>
+        </w:tc>
+        <w:tc>
+          <w:tcPr>
+            <w:tcW w:w="4680" w:type="dxa"/>
+            <w:tcMar>
+              <w:top w:w="100" w:type="dxa"/>
+              <w:left w:w="100" w:type="dxa"/>
+              <w:bottom w:w="100" w:type="dxa"/>
+              <w:right w:w="100" w:type="dxa"/>
+            </w:tcMar>
+          </w:tcPr>
+          <w:p>
+            <w:pPr>
+              <w:rPr>
+                <w:rFonts w:ascii="Verdana" w:eastAsia="Verdana" w:hAnsi="Verdana" w:cs="Verdana"/>
+                <w:b/>
+                <w:bCs/>
+                <w:sz w:val="24"/>
+                <w:szCs w:val="24"/>
+              </w:rPr>
+            </w:pPr>
             <w:r>
               <w:rPr>
                 <w:rFonts w:ascii="Verdana" w:eastAsia="Verdana" w:hAnsi="Verdana" w:cs="Verdana"/>
@@ -4095,7 +4382,40 @@
                 <w:szCs w:val="24"/>
               </w:rPr>
               <w:lastRenderedPageBreak/>
-              <w:t>normas especiales sobre el endeudamiento por parte del agente).</w:t>
+              <w:t>(</w:t>
+            </w:r>
+            <w:r>
+              <w:rPr>
+                <w:rFonts w:ascii="Verdana" w:eastAsia="Verdana" w:hAnsi="Verdana" w:cs="Verdana"/>
+                <w:b/>
+                <w:bCs/>
+                <w:i/>
+                <w:iCs/>
+                <w:sz w:val="24"/>
+                <w:szCs w:val="24"/>
+              </w:rPr>
+              <w:t>NOTA</w:t>
+            </w:r>
+            <w:r>
+              <w:rPr>
+                <w:rFonts w:ascii="Verdana" w:eastAsia="Verdana" w:hAnsi="Verdana" w:cs="Verdana"/>
+                <w:i/>
+                <w:iCs/>
+                <w:sz w:val="24"/>
+                <w:szCs w:val="24"/>
+              </w:rPr>
+              <w:t xml:space="preserve">: Aquí puede incluir cualquier limitación específica que considere apropiada, como la prohibición o las </w:t>
+            </w:r>
+            <w:r>
+              <w:rPr>
+                <w:rFonts w:ascii="Verdana" w:eastAsia="Verdana" w:hAnsi="Verdana" w:cs="Verdana"/>
+                <w:i/>
+                <w:iCs/>
+                <w:sz w:val="24"/>
+                <w:szCs w:val="24"/>
+              </w:rPr>
+              <w:lastRenderedPageBreak/>
+              <w:t>condiciones para la venta de determinadas acciones o bienes o normas especiales sobre el endeudamiento por parte del agente).</w:t>
             </w:r>
           </w:p>
         </w:tc>
@@ -4378,31 +4698,9 @@
                 <w:sz w:val="24"/>
                 <w:szCs w:val="24"/>
               </w:rPr>
-              <w:t>(NOTE: Here you may add any other delegable powers including, without limitation, power to make gifts, exercise powers of appointment, name or change beneficiaries or joint tenants or revoke or amend any trust specifically referred to below.)</w:t>
-            </w:r>
-          </w:p>
-          <w:p>
-            <w:pPr>
-              <w:rPr>
-                <w:rFonts w:ascii="Verdana" w:eastAsia="Verdana" w:hAnsi="Verdana" w:cs="Verdana"/>
-                <w:sz w:val="24"/>
-                <w:szCs w:val="24"/>
-              </w:rPr>
-            </w:pPr>
-          </w:p>
-        </w:tc>
-        <w:tc>
-          <w:tcPr>
-            <w:tcW w:w="4680" w:type="dxa"/>
-            <w:tcMar>
-              <w:top w:w="100" w:type="dxa"/>
-              <w:left w:w="100" w:type="dxa"/>
-              <w:bottom w:w="100" w:type="dxa"/>
-              <w:right w:w="100" w:type="dxa"/>
-            </w:tcMar>
-          </w:tcPr>
-          <w:p>
-            <w:pPr>
+              <w:t>(</w:t>
+            </w:r>
+            <w:r>
               <w:rPr>
                 <w:rFonts w:ascii="Verdana" w:eastAsia="Verdana" w:hAnsi="Verdana" w:cs="Verdana"/>
                 <w:b/>
@@ -4410,16 +4708,78 @@
                 <w:sz w:val="24"/>
                 <w:szCs w:val="24"/>
               </w:rPr>
-            </w:pPr>
-            <w:r>
-              <w:rPr>
-                <w:rFonts w:ascii="Verdana" w:eastAsia="Verdana" w:hAnsi="Verdana" w:cs="Verdana"/>
-                <w:i/>
-                <w:iCs/>
-                <w:sz w:val="24"/>
-                <w:szCs w:val="24"/>
-              </w:rPr>
-              <w:t>(NOTA: Aquí puede añadir cualquier otro poder delegable, incluyendo, sin limitación, el poder de hacer donaciones, ejercer poderes de designación, nombrar o cambiar beneficiarios o cotitulares, o revocar o modificar cualquier fideicomiso específicamente mencionado a continuación).</w:t>
+              <w:t>NOTE</w:t>
+            </w:r>
+            <w:r>
+              <w:rPr>
+                <w:rFonts w:ascii="Verdana" w:eastAsia="Verdana" w:hAnsi="Verdana" w:cs="Verdana"/>
+                <w:sz w:val="24"/>
+                <w:szCs w:val="24"/>
+              </w:rPr>
+              <w:t>: Here you may add any other delegable powers including, without limitation, power to make gifts, exercise powers of appointment, name or change beneficiaries or joint tenants or revoke or amend any trust specifically referred to below.)</w:t>
+            </w:r>
+          </w:p>
+          <w:p>
+            <w:pPr>
+              <w:rPr>
+                <w:rFonts w:ascii="Verdana" w:eastAsia="Verdana" w:hAnsi="Verdana" w:cs="Verdana"/>
+                <w:sz w:val="24"/>
+                <w:szCs w:val="24"/>
+              </w:rPr>
+            </w:pPr>
+          </w:p>
+        </w:tc>
+        <w:tc>
+          <w:tcPr>
+            <w:tcW w:w="4680" w:type="dxa"/>
+            <w:tcMar>
+              <w:top w:w="100" w:type="dxa"/>
+              <w:left w:w="100" w:type="dxa"/>
+              <w:bottom w:w="100" w:type="dxa"/>
+              <w:right w:w="100" w:type="dxa"/>
+            </w:tcMar>
+          </w:tcPr>
+          <w:p>
+            <w:pPr>
+              <w:rPr>
+                <w:rFonts w:ascii="Verdana" w:eastAsia="Verdana" w:hAnsi="Verdana" w:cs="Verdana"/>
+                <w:b/>
+                <w:bCs/>
+                <w:sz w:val="24"/>
+                <w:szCs w:val="24"/>
+              </w:rPr>
+            </w:pPr>
+            <w:r>
+              <w:rPr>
+                <w:rFonts w:ascii="Verdana" w:eastAsia="Verdana" w:hAnsi="Verdana" w:cs="Verdana"/>
+                <w:i/>
+                <w:iCs/>
+                <w:sz w:val="24"/>
+                <w:szCs w:val="24"/>
+              </w:rPr>
+              <w:t>(</w:t>
+            </w:r>
+            <w:r>
+              <w:rPr>
+                <w:rFonts w:ascii="Verdana" w:eastAsia="Verdana" w:hAnsi="Verdana" w:cs="Verdana"/>
+                <w:b/>
+                <w:bCs/>
+                <w:i/>
+                <w:iCs/>
+                <w:sz w:val="24"/>
+                <w:szCs w:val="24"/>
+              </w:rPr>
+              <w:t>NOTA</w:t>
+            </w:r>
+            <w:r>
+              <w:rPr>
+                <w:rFonts w:ascii="Verdana" w:eastAsia="Verdana" w:hAnsi="Verdana" w:cs="Verdana"/>
+                <w:i/>
+                <w:iCs/>
+                <w:sz w:val="24"/>
+                <w:szCs w:val="24"/>
+              </w:rPr>
+              <w:t>: Aquí puede añadir cualquier otro poder delegable, incluyendo, sin limitación, el poder de hacer donaciones, ejercer poderes de designación, nombrar o cambiar beneficiarios o cotitulares, o revocar o modificar cualquier fideicomiso específicamente mencionado a continuación).</w:t>
             </w:r>
           </w:p>
         </w:tc>
@@ -4663,58 +5023,78 @@
                 <w:sz w:val="24"/>
                 <w:szCs w:val="24"/>
               </w:rPr>
-              <w:t xml:space="preserve">(NOTE: Your agent will have authority to employ other persons </w:t>
-            </w:r>
-            <w:r>
-              <w:rPr>
-                <w:rFonts w:ascii="Verdana" w:eastAsia="Verdana" w:hAnsi="Verdana" w:cs="Verdana"/>
-                <w:sz w:val="24"/>
-                <w:szCs w:val="24"/>
-              </w:rPr>
               <w:lastRenderedPageBreak/>
-              <w:t>as necessary to enable the agent to properly exercise the powers granted in this form, but your agent will have to make all discretionary decisions. If you want to give your agent the right to delegate discretionary decision-making powers to others, you should keep paragraph 4, otherwise it should be struck out.)</w:t>
-            </w:r>
-          </w:p>
-        </w:tc>
-        <w:tc>
-          <w:tcPr>
-            <w:tcW w:w="4680" w:type="dxa"/>
-            <w:tcMar>
-              <w:top w:w="100" w:type="dxa"/>
-              <w:left w:w="100" w:type="dxa"/>
-              <w:bottom w:w="100" w:type="dxa"/>
-              <w:right w:w="100" w:type="dxa"/>
-            </w:tcMar>
-          </w:tcPr>
-          <w:p>
-            <w:pPr>
-              <w:rPr>
-                <w:rFonts w:ascii="Verdana" w:eastAsia="Verdana" w:hAnsi="Verdana" w:cs="Verdana"/>
-                <w:sz w:val="24"/>
-                <w:szCs w:val="24"/>
-              </w:rPr>
-            </w:pPr>
-            <w:r>
-              <w:rPr>
-                <w:rFonts w:ascii="Verdana" w:eastAsia="Verdana" w:hAnsi="Verdana" w:cs="Verdana"/>
-                <w:i/>
-                <w:iCs/>
-                <w:sz w:val="24"/>
-                <w:szCs w:val="24"/>
-              </w:rPr>
-              <w:lastRenderedPageBreak/>
-              <w:t xml:space="preserve">(NOTA: Su agente tendrá autoridad para contratar o recurrir a otras </w:t>
-            </w:r>
-            <w:r>
-              <w:rPr>
-                <w:rFonts w:ascii="Verdana" w:eastAsia="Verdana" w:hAnsi="Verdana" w:cs="Verdana"/>
-                <w:i/>
-                <w:iCs/>
-                <w:sz w:val="24"/>
-                <w:szCs w:val="24"/>
-              </w:rPr>
-              <w:lastRenderedPageBreak/>
-              <w:t>personas según sea necesario para poder ejercer adecuadamente las facultades otorgadas en este formulario, pero su agente deberá tomar todas las decisiones discrecionales. Si desea otorgar a su agente el derecho de delegar poderes discrecionales de toma de decisiones a otras personas, debe mantener el párrafo 4; de lo contrario, debe tacharlo).</w:t>
+              <w:t>(</w:t>
+            </w:r>
+            <w:r>
+              <w:rPr>
+                <w:rFonts w:ascii="Verdana" w:eastAsia="Verdana" w:hAnsi="Verdana" w:cs="Verdana"/>
+                <w:b/>
+                <w:bCs/>
+                <w:sz w:val="24"/>
+                <w:szCs w:val="24"/>
+              </w:rPr>
+              <w:t>NOTE</w:t>
+            </w:r>
+            <w:r>
+              <w:rPr>
+                <w:rFonts w:ascii="Verdana" w:eastAsia="Verdana" w:hAnsi="Verdana" w:cs="Verdana"/>
+                <w:sz w:val="24"/>
+                <w:szCs w:val="24"/>
+              </w:rPr>
+              <w:t>: Your agent will have authority to employ other persons as necessary to enable the agent to properly exercise the powers granted in this form, but your agent will have to make all discretionary decisions. If you want to give your agent the right to delegate discretionary decision-making powers to others, you should keep paragraph 4, otherwise it should be struck out.)</w:t>
+            </w:r>
+          </w:p>
+        </w:tc>
+        <w:tc>
+          <w:tcPr>
+            <w:tcW w:w="4680" w:type="dxa"/>
+            <w:tcMar>
+              <w:top w:w="100" w:type="dxa"/>
+              <w:left w:w="100" w:type="dxa"/>
+              <w:bottom w:w="100" w:type="dxa"/>
+              <w:right w:w="100" w:type="dxa"/>
+            </w:tcMar>
+          </w:tcPr>
+          <w:p>
+            <w:pPr>
+              <w:rPr>
+                <w:rFonts w:ascii="Verdana" w:eastAsia="Verdana" w:hAnsi="Verdana" w:cs="Verdana"/>
+                <w:sz w:val="24"/>
+                <w:szCs w:val="24"/>
+              </w:rPr>
+            </w:pPr>
+            <w:r>
+              <w:rPr>
+                <w:rFonts w:ascii="Verdana" w:eastAsia="Verdana" w:hAnsi="Verdana" w:cs="Verdana"/>
+                <w:i/>
+                <w:iCs/>
+                <w:sz w:val="24"/>
+                <w:szCs w:val="24"/>
+              </w:rPr>
+              <w:t>(</w:t>
+            </w:r>
+            <w:r>
+              <w:rPr>
+                <w:rFonts w:ascii="Verdana" w:eastAsia="Verdana" w:hAnsi="Verdana" w:cs="Verdana"/>
+                <w:b/>
+                <w:bCs/>
+                <w:i/>
+                <w:iCs/>
+                <w:sz w:val="24"/>
+                <w:szCs w:val="24"/>
+              </w:rPr>
+              <w:t>NOTA</w:t>
+            </w:r>
+            <w:r>
+              <w:rPr>
+                <w:rFonts w:ascii="Verdana" w:eastAsia="Verdana" w:hAnsi="Verdana" w:cs="Verdana"/>
+                <w:i/>
+                <w:iCs/>
+                <w:sz w:val="24"/>
+                <w:szCs w:val="24"/>
+              </w:rPr>
+              <w:t>: Su agente tendrá autoridad para contratar o recurrir a otras personas según sea necesario para poder ejercer adecuadamente las facultades otorgadas en este formulario, pero su agente deberá tomar todas las decisiones discrecionales. Si desea otorgar a su agente el derecho de delegar poderes discrecionales de toma de decisiones a otras personas, debe mantener el párrafo 4; de lo contrario, debe tacharlo).</w:t>
             </w:r>
           </w:p>
         </w:tc>
@@ -4784,7 +5164,7 @@
                 <w:sz w:val="24"/>
                 <w:szCs w:val="24"/>
               </w:rPr>
-              <w:t xml:space="preserve">{% if delegate_decisions == “anyone” %}My agent shall have the right by written instrument to delegate any or all of the foregoing powers involving discretionary decision-making to any person or persons whom my agent may select, but such delegation may be amended or revoked by any agent (including any successor) named by me who is acting under this power of attorney at the time of reference.{% elif delegate_decisions == “authorized” %}My agent shall have the right by written instrument to delegate any or all of the foregoing powers involving discretionary decision-making to {{delegate.name_full()}}, but such delegation may be amended or revoked by any agent (including any successor) named by me who is acting under this power of attorney at the time of reference.{% else </w:t>
+              <w:t xml:space="preserve">{% if delegate_decisions == “anyone” %}My agent shall have the right by written instrument to delegate any or all of the foregoing powers involving discretionary decision-making to any person or persons whom my agent may select, but such delegation may be amended or revoked by any agent (including any successor) named by me who is acting under this power of attorney at the time of reference.{% elif delegate_decisions == “authorized” %}My agent shall have the right by written instrument to delegate any or all of the foregoing powers involving discretionary decision-making to {{delegate.name_full()}}, but such delegation may be amended or revoked by any agent (including any successor) named by me who is </w:t>
             </w:r>
             <w:r>
               <w:rPr>
@@ -4793,7 +5173,7 @@
                 <w:szCs w:val="24"/>
               </w:rPr>
               <w:lastRenderedPageBreak/>
-              <w:t>%}</w:t>
+              <w:t>acting under this power of attorney at the time of reference.{% else %}</w:t>
             </w:r>
             <w:r>
               <w:rPr>
@@ -4863,7 +5243,7 @@
                 <w:sz w:val="24"/>
                 <w:szCs w:val="24"/>
               </w:rPr>
-              <w:t xml:space="preserve">Mi agente tendrá derecho, mediante instrumento escrito, a delegar cualquiera o todas las facultades anteriores que impliquen la toma de decisiones discrecionales a {{delegate.name_full()}}, pero dicha delegación podrá ser modificada o revocada por cualquier agente (incluido cualquier sucesor) </w:t>
+              <w:t xml:space="preserve">Mi agente tendrá derecho, mediante instrumento escrito, a delegar cualquiera o todas las facultades anteriores que impliquen la toma de decisiones discrecionales a {{delegate.name_full()}}, pero dicha delegación podrá ser </w:t>
             </w:r>
             <w:r>
               <w:rPr>
@@ -4874,7 +5254,7 @@
                 <w:szCs w:val="24"/>
               </w:rPr>
               <w:lastRenderedPageBreak/>
-              <w:t>nombrado por mí que actúe en virtud de este poder notarial en ese momento</w:t>
+              <w:t>modificada o revocada por cualquier agente (incluido cualquier sucesor) nombrado por mí que actúe en virtud de este poder notarial en ese momento</w:t>
             </w:r>
             <w:r>
               <w:rPr>
@@ -4938,23 +5318,9 @@
                 <w:sz w:val="24"/>
                 <w:szCs w:val="24"/>
               </w:rPr>
-              <w:lastRenderedPageBreak/>
-              <w:t>(NOTE: Your agent will be entitled to reimbursement for all reasonable expenses incurred in acting under this power of attorney. Strike out paragraph 5 if you do not want your agent to also be entitled to reasonable compensation for services as agent.)</w:t>
-            </w:r>
-          </w:p>
-        </w:tc>
-        <w:tc>
-          <w:tcPr>
-            <w:tcW w:w="4680" w:type="dxa"/>
-            <w:tcMar>
-              <w:top w:w="100" w:type="dxa"/>
-              <w:left w:w="100" w:type="dxa"/>
-              <w:bottom w:w="100" w:type="dxa"/>
-              <w:right w:w="100" w:type="dxa"/>
-            </w:tcMar>
-          </w:tcPr>
-          <w:p>
-            <w:pPr>
+              <w:t>(</w:t>
+            </w:r>
+            <w:r>
               <w:rPr>
                 <w:rFonts w:ascii="Verdana" w:eastAsia="Verdana" w:hAnsi="Verdana" w:cs="Verdana"/>
                 <w:b/>
@@ -4962,16 +5328,69 @@
                 <w:sz w:val="24"/>
                 <w:szCs w:val="24"/>
               </w:rPr>
-            </w:pPr>
-            <w:r>
-              <w:rPr>
-                <w:rFonts w:ascii="Verdana" w:eastAsia="Verdana" w:hAnsi="Verdana" w:cs="Verdana"/>
-                <w:i/>
-                <w:iCs/>
-                <w:sz w:val="24"/>
-                <w:szCs w:val="24"/>
-              </w:rPr>
-              <w:t>(NOTA: Su agente tendrá derecho al reembolso de todos los gastos razonables en que incurra al ejercer este poder notarial. Tache el párrafo 5 si no desea que su agente tenga también derecho a una compensación razonable por los servicios prestados como agente).</w:t>
+              <w:t>NOTE</w:t>
+            </w:r>
+            <w:r>
+              <w:rPr>
+                <w:rFonts w:ascii="Verdana" w:eastAsia="Verdana" w:hAnsi="Verdana" w:cs="Verdana"/>
+                <w:sz w:val="24"/>
+                <w:szCs w:val="24"/>
+              </w:rPr>
+              <w:t>: Your agent will be entitled to reimbursement for all reasonable expenses incurred in acting under this power of attorney. Strike out paragraph 5 if you do not want your agent to also be entitled to reasonable compensation for services as agent.)</w:t>
+            </w:r>
+          </w:p>
+        </w:tc>
+        <w:tc>
+          <w:tcPr>
+            <w:tcW w:w="4680" w:type="dxa"/>
+            <w:tcMar>
+              <w:top w:w="100" w:type="dxa"/>
+              <w:left w:w="100" w:type="dxa"/>
+              <w:bottom w:w="100" w:type="dxa"/>
+              <w:right w:w="100" w:type="dxa"/>
+            </w:tcMar>
+          </w:tcPr>
+          <w:p>
+            <w:pPr>
+              <w:rPr>
+                <w:rFonts w:ascii="Verdana" w:eastAsia="Verdana" w:hAnsi="Verdana" w:cs="Verdana"/>
+                <w:b/>
+                <w:bCs/>
+                <w:sz w:val="24"/>
+                <w:szCs w:val="24"/>
+              </w:rPr>
+            </w:pPr>
+            <w:r>
+              <w:rPr>
+                <w:rFonts w:ascii="Verdana" w:eastAsia="Verdana" w:hAnsi="Verdana" w:cs="Verdana"/>
+                <w:i/>
+                <w:iCs/>
+                <w:sz w:val="24"/>
+                <w:szCs w:val="24"/>
+              </w:rPr>
+              <w:t>(</w:t>
+            </w:r>
+            <w:r>
+              <w:rPr>
+                <w:rFonts w:ascii="Verdana" w:eastAsia="Verdana" w:hAnsi="Verdana" w:cs="Verdana"/>
+                <w:b/>
+                <w:bCs/>
+                <w:i/>
+                <w:iCs/>
+                <w:sz w:val="24"/>
+                <w:szCs w:val="24"/>
+              </w:rPr>
+              <w:t>NOTA</w:t>
+            </w:r>
+            <w:r>
+              <w:rPr>
+                <w:rFonts w:ascii="Verdana" w:eastAsia="Verdana" w:hAnsi="Verdana" w:cs="Verdana"/>
+                <w:i/>
+                <w:iCs/>
+                <w:sz w:val="24"/>
+                <w:szCs w:val="24"/>
+              </w:rPr>
+              <w:t>: Su agente tendrá derecho al reembolso de todos los gastos razonables en que incurra al ejercer este poder notarial. Tache el párrafo 5 si no desea que su agente tenga también derecho a una compensación razonable por los servicios prestados como agente).</w:t>
             </w:r>
           </w:p>
         </w:tc>
@@ -5055,7 +5474,7 @@
                 <w:sz w:val="24"/>
                 <w:szCs w:val="24"/>
               </w:rPr>
-              <w:t xml:space="preserve">{% if agent_compensation == “discretion” %}My agent shall be entitled to reasonable compensation for services rendered as agent under this power of attorney.{% elif agent_compensation == “with_limits” %}My agent shall be entitled to compensation not to exceed {{currency(compensate_amount)}} {{compensate_time.lower()}} for </w:t>
+              <w:t xml:space="preserve">{% if agent_compensation == “discretion” %}My agent shall be entitled to reasonable compensation for services rendered as agent under this power of attorney.{% elif agent_compensation == “with_limits” %}My agent shall be entitled to compensation not to exceed </w:t>
             </w:r>
             <w:r>
               <w:rPr>
@@ -5064,7 +5483,7 @@
                 <w:szCs w:val="24"/>
               </w:rPr>
               <w:lastRenderedPageBreak/>
-              <w:t>services rendered as agent under this power of attorney.{% elif agent_compensation == “expenses_only” %}My agent shall not be entitled to reasonable compensation for their services. They will only be entitled to reimbursement for reasonable expenses.{% else %}</w:t>
+              <w:t>{{currency(compensate_amount)}} {{compensate_time.lower()}} for services rendered as agent under this power of attorney.{% elif agent_compensation == “expenses_only” %}My agent shall not be entitled to reasonable compensation for their services. They will only be entitled to reimbursement for reasonable expenses.{% else %}</w:t>
             </w:r>
             <w:r>
               <w:rPr>
@@ -5158,36 +5577,194 @@
                 <w:sz w:val="24"/>
                 <w:szCs w:val="24"/>
               </w:rPr>
-              <w:t xml:space="preserve"> {{currency(compensate_amount)}} {{compensate_time.lower()}}</w:t>
-            </w:r>
-            <w:r>
-              <w:rPr>
-                <w:rFonts w:ascii="Verdana" w:eastAsia="Verdana" w:hAnsi="Verdana" w:cs="Verdana"/>
-                <w:sz w:val="24"/>
-                <w:szCs w:val="24"/>
-              </w:rPr>
               <w:t xml:space="preserve"> </w:t>
             </w:r>
             <w:r>
               <w:rPr>
                 <w:rFonts w:ascii="Verdana" w:eastAsia="Verdana" w:hAnsi="Verdana" w:cs="Verdana"/>
-                <w:i/>
-                <w:iCs/>
-                <w:sz w:val="24"/>
-                <w:szCs w:val="24"/>
-              </w:rPr>
-              <w:t xml:space="preserve">por </w:t>
-            </w:r>
-            <w:r>
-              <w:rPr>
-                <w:rFonts w:ascii="Verdana" w:eastAsia="Verdana" w:hAnsi="Verdana" w:cs="Verdana"/>
-                <w:i/>
-                <w:iCs/>
                 <w:sz w:val="24"/>
                 <w:szCs w:val="24"/>
               </w:rPr>
               <w:lastRenderedPageBreak/>
-              <w:t>los servicios prestados como agente en virtud de este poder notarial</w:t>
+              <w:t xml:space="preserve">{{currency(compensate_amount)}} </w:t>
+            </w:r>
+            <w:r>
+              <w:rPr>
+                <w:rFonts w:ascii="Verdana" w:eastAsia="Verdana" w:hAnsi="Verdana" w:cs="Verdana"/>
+                <w:sz w:val="24"/>
+                <w:szCs w:val="24"/>
+              </w:rPr>
+              <w:t>{% if compensate_time == "per hour"</w:t>
+            </w:r>
+            <w:r>
+              <w:rPr>
+                <w:rFonts w:ascii="Verdana" w:eastAsia="Verdana" w:hAnsi="Verdana" w:cs="Verdana"/>
+                <w:sz w:val="24"/>
+                <w:szCs w:val="24"/>
+              </w:rPr>
+              <w:t xml:space="preserve"> %</w:t>
+            </w:r>
+            <w:r>
+              <w:rPr>
+                <w:rFonts w:ascii="Verdana" w:eastAsia="Verdana" w:hAnsi="Verdana" w:cs="Verdana"/>
+                <w:sz w:val="24"/>
+                <w:szCs w:val="24"/>
+              </w:rPr>
+              <w:t>}</w:t>
+            </w:r>
+            <w:r>
+              <w:rPr>
+                <w:rFonts w:ascii="Verdana" w:eastAsia="Verdana" w:hAnsi="Verdana" w:cs="Verdana"/>
+                <w:i/>
+                <w:iCs/>
+                <w:sz w:val="24"/>
+                <w:szCs w:val="24"/>
+              </w:rPr>
+              <w:t>por hora</w:t>
+            </w:r>
+            <w:r>
+              <w:rPr>
+                <w:rFonts w:ascii="Verdana" w:eastAsia="Verdana" w:hAnsi="Verdana" w:cs="Verdana"/>
+                <w:sz w:val="24"/>
+                <w:szCs w:val="24"/>
+              </w:rPr>
+              <w:t>{% elif compensate_time == "per day"</w:t>
+            </w:r>
+            <w:r>
+              <w:rPr>
+                <w:rFonts w:ascii="Verdana" w:eastAsia="Verdana" w:hAnsi="Verdana" w:cs="Verdana"/>
+                <w:sz w:val="24"/>
+                <w:szCs w:val="24"/>
+              </w:rPr>
+              <w:t xml:space="preserve"> %</w:t>
+            </w:r>
+            <w:r>
+              <w:rPr>
+                <w:rFonts w:ascii="Verdana" w:eastAsia="Verdana" w:hAnsi="Verdana" w:cs="Verdana"/>
+                <w:sz w:val="24"/>
+                <w:szCs w:val="24"/>
+              </w:rPr>
+              <w:t>}</w:t>
+            </w:r>
+            <w:r>
+              <w:rPr>
+                <w:rFonts w:ascii="Verdana" w:eastAsia="Verdana" w:hAnsi="Verdana" w:cs="Verdana"/>
+                <w:i/>
+                <w:iCs/>
+                <w:sz w:val="24"/>
+                <w:szCs w:val="24"/>
+              </w:rPr>
+              <w:t>al día</w:t>
+            </w:r>
+            <w:r>
+              <w:rPr>
+                <w:rFonts w:ascii="Verdana" w:eastAsia="Verdana" w:hAnsi="Verdana" w:cs="Verdana"/>
+                <w:sz w:val="24"/>
+                <w:szCs w:val="24"/>
+              </w:rPr>
+              <w:t>{% elif compensate_time == "per week"</w:t>
+            </w:r>
+            <w:r>
+              <w:rPr>
+                <w:rFonts w:ascii="Verdana" w:eastAsia="Verdana" w:hAnsi="Verdana" w:cs="Verdana"/>
+                <w:sz w:val="24"/>
+                <w:szCs w:val="24"/>
+              </w:rPr>
+              <w:t xml:space="preserve"> %</w:t>
+            </w:r>
+            <w:r>
+              <w:rPr>
+                <w:rFonts w:ascii="Verdana" w:eastAsia="Verdana" w:hAnsi="Verdana" w:cs="Verdana"/>
+                <w:sz w:val="24"/>
+                <w:szCs w:val="24"/>
+              </w:rPr>
+              <w:t>}</w:t>
+            </w:r>
+            <w:r>
+              <w:rPr>
+                <w:rFonts w:ascii="Verdana" w:eastAsia="Verdana" w:hAnsi="Verdana" w:cs="Verdana"/>
+                <w:i/>
+                <w:iCs/>
+                <w:sz w:val="24"/>
+                <w:szCs w:val="24"/>
+              </w:rPr>
+              <w:t>por semana</w:t>
+            </w:r>
+            <w:r>
+              <w:rPr>
+                <w:rFonts w:ascii="Verdana" w:eastAsia="Verdana" w:hAnsi="Verdana" w:cs="Verdana"/>
+                <w:sz w:val="24"/>
+                <w:szCs w:val="24"/>
+              </w:rPr>
+              <w:t>{% else</w:t>
+            </w:r>
+            <w:r>
+              <w:rPr>
+                <w:rFonts w:ascii="Verdana" w:eastAsia="Verdana" w:hAnsi="Verdana" w:cs="Verdana"/>
+                <w:sz w:val="24"/>
+                <w:szCs w:val="24"/>
+              </w:rPr>
+              <w:t xml:space="preserve"> %</w:t>
+            </w:r>
+            <w:r>
+              <w:rPr>
+                <w:rFonts w:ascii="Verdana" w:eastAsia="Verdana" w:hAnsi="Verdana" w:cs="Verdana"/>
+                <w:sz w:val="24"/>
+                <w:szCs w:val="24"/>
+              </w:rPr>
+              <w:t>}</w:t>
+            </w:r>
+            <w:r>
+              <w:rPr>
+                <w:rFonts w:ascii="Verdana" w:eastAsia="Verdana" w:hAnsi="Verdana" w:cs="Verdana"/>
+                <w:i/>
+                <w:iCs/>
+                <w:sz w:val="24"/>
+                <w:szCs w:val="24"/>
+              </w:rPr>
+              <w:t>al mes</w:t>
+            </w:r>
+            <w:r>
+              <w:rPr>
+                <w:rFonts w:ascii="Verdana" w:eastAsia="Verdana" w:hAnsi="Verdana" w:cs="Verdana"/>
+                <w:sz w:val="24"/>
+                <w:szCs w:val="24"/>
+              </w:rPr>
+              <w:t>{% endif</w:t>
+            </w:r>
+            <w:r>
+              <w:rPr>
+                <w:rFonts w:ascii="Verdana" w:eastAsia="Verdana" w:hAnsi="Verdana" w:cs="Verdana"/>
+                <w:sz w:val="24"/>
+                <w:szCs w:val="24"/>
+              </w:rPr>
+              <w:t xml:space="preserve"> %</w:t>
+            </w:r>
+            <w:r>
+              <w:rPr>
+                <w:rFonts w:ascii="Verdana" w:eastAsia="Verdana" w:hAnsi="Verdana" w:cs="Verdana"/>
+                <w:sz w:val="24"/>
+                <w:szCs w:val="24"/>
+              </w:rPr>
+              <w:t>}</w:t>
+            </w:r>
+            <w:r>
+              <w:rPr>
+                <w:rFonts w:ascii="Verdana" w:eastAsia="Verdana" w:hAnsi="Verdana" w:cs="Verdana"/>
+                <w:sz w:val="24"/>
+                <w:szCs w:val="24"/>
+              </w:rPr>
+              <w:t xml:space="preserve"> </w:t>
+            </w:r>
+            <w:r>
+              <w:rPr>
+                <w:rFonts w:ascii="Verdana" w:eastAsia="Verdana" w:hAnsi="Verdana" w:cs="Verdana"/>
+                <w:i/>
+                <w:iCs/>
+                <w:sz w:val="24"/>
+                <w:szCs w:val="24"/>
+              </w:rPr>
+              <w:t>por los servicios prestados como agente en virtud de este poder notarial</w:t>
             </w:r>
             <w:r>
               <w:rPr>
@@ -5263,7 +5840,25 @@
                 <w:szCs w:val="24"/>
               </w:rPr>
               <w:lastRenderedPageBreak/>
-              <w:t xml:space="preserve">(NOTE: </w:t>
+              <w:t>(</w:t>
+            </w:r>
+            <w:r>
+              <w:rPr>
+                <w:rFonts w:ascii="Verdana" w:eastAsia="Verdana" w:hAnsi="Verdana" w:cs="Verdana"/>
+                <w:b/>
+                <w:bCs/>
+                <w:sz w:val="24"/>
+                <w:szCs w:val="24"/>
+              </w:rPr>
+              <w:t>NOTE</w:t>
+            </w:r>
+            <w:r>
+              <w:rPr>
+                <w:rFonts w:ascii="Verdana" w:eastAsia="Verdana" w:hAnsi="Verdana" w:cs="Verdana"/>
+                <w:sz w:val="24"/>
+                <w:szCs w:val="24"/>
+              </w:rPr>
+              <w:t xml:space="preserve">: </w:t>
             </w:r>
             <w:r>
               <w:rPr>
@@ -5303,7 +5898,29 @@
                 <w:sz w:val="24"/>
                 <w:szCs w:val="24"/>
               </w:rPr>
-              <w:t>(NOTA: Usted puede modificar o revocar este poder notarial en cualquier momento y de cualquier manera. A menos que se modifique o revoque, la autoridad otorgada en este poder notarial entrará en vigor en el momento en que se firme y continuará hasta su fallecimiento, a menos que se establezca una limitación en la fecha de inicio o la duración mediante la colocación de sus iniciales y el cumplimiento de uno o ambos párrafos 6 y 7).</w:t>
+              <w:t>(</w:t>
+            </w:r>
+            <w:r>
+              <w:rPr>
+                <w:rFonts w:ascii="Verdana" w:eastAsia="Verdana" w:hAnsi="Verdana" w:cs="Verdana"/>
+                <w:b/>
+                <w:bCs/>
+                <w:i/>
+                <w:iCs/>
+                <w:sz w:val="24"/>
+                <w:szCs w:val="24"/>
+              </w:rPr>
+              <w:t>NOTA</w:t>
+            </w:r>
+            <w:r>
+              <w:rPr>
+                <w:rFonts w:ascii="Verdana" w:eastAsia="Verdana" w:hAnsi="Verdana" w:cs="Verdana"/>
+                <w:i/>
+                <w:iCs/>
+                <w:sz w:val="24"/>
+                <w:szCs w:val="24"/>
+              </w:rPr>
+              <w:t>: Usted puede modificar o revocar este poder notarial en cualquier momento y de cualquier manera. A menos que se modifique o revoque, la autoridad otorgada en este poder notarial entrará en vigor en el momento en que se firme y continuará hasta su fallecimiento, a menos que se establezca una limitación en la fecha de inicio o la duración mediante la colocación de sus iniciales y el cumplimiento de uno o ambos párrafos 6 y 7).</w:t>
             </w:r>
           </w:p>
         </w:tc>
@@ -5483,6 +6100,7 @@
                 <w:sz w:val="24"/>
                 <w:szCs w:val="24"/>
               </w:rPr>
+              <w:lastRenderedPageBreak/>
               <w:t>Note: Responses must be written in English to be used in Illinois.</w:t>
             </w:r>
           </w:p>
@@ -5567,8 +6185,7 @@
                 <w:sz w:val="24"/>
                 <w:szCs w:val="24"/>
               </w:rPr>
-              <w:lastRenderedPageBreak/>
-              <w:t>{% if effective_date_choice == “doctor” %}only during times when a doctor has decided that I cannot make decisions for myself{% elif effective_date_choice == “detained” %}only if I am arrested, detained, or deported by law enforcement and I am unable to make financial decisions{% elif effective_date_choice == “immigration” %}when an Adverse Immigration Action occurs, defined as an arrest, detention, or apprehension by ICE, CBP, or DHS, and/or any other federal action restricting my ability to be in or manage affairs in the United States{% elif effective_date_choice == “other” %}on {{effective_date_text}}{% else %}immediately{% endif %}.</w:t>
+              <w:t>{% if effective_date_choice == “doctor” %}only during times when a doctor has decided that I cannot make decisions for myself{% elif effective_date_choice == “detained” %}only if I am arrested, detained, or deported by law enforcement and I am unable to make financial decisions{% elif effective_date_choice == “immigration” %}when an Adverse Immigration Action occurs, defined as an arrest, detention, or apprehension by ICE, CBP, or DHS, and/or any other federal action restricting my ability to be in or manage affairs in the United States{% elif effective_date_choice == “other” %}{{effective_date_text}}{% else %}immediately{% endif %}.</w:t>
             </w:r>
           </w:p>
         </w:tc>
@@ -5628,11 +6245,9 @@
                 <w:sz w:val="24"/>
                 <w:szCs w:val="24"/>
               </w:rPr>
-              <w:t>(NOTE: Insert a future date or event during your lifetime, such as a court determination of your disability or a written determination by your physician that you are incapacitated, when you want this power to first take effect.)</w:t>
-            </w:r>
-          </w:p>
-          <w:p>
-            <w:pPr>
+              <w:t>(</w:t>
+            </w:r>
+            <w:r>
               <w:rPr>
                 <w:rFonts w:ascii="Verdana" w:eastAsia="Verdana" w:hAnsi="Verdana" w:cs="Verdana"/>
                 <w:b/>
@@ -5640,19 +6255,17 @@
                 <w:sz w:val="24"/>
                 <w:szCs w:val="24"/>
               </w:rPr>
-            </w:pPr>
-          </w:p>
-        </w:tc>
-        <w:tc>
-          <w:tcPr>
-            <w:tcW w:w="4680" w:type="dxa"/>
-            <w:tcMar>
-              <w:top w:w="100" w:type="dxa"/>
-              <w:left w:w="100" w:type="dxa"/>
-              <w:bottom w:w="100" w:type="dxa"/>
-              <w:right w:w="100" w:type="dxa"/>
-            </w:tcMar>
-          </w:tcPr>
+              <w:t>NOTE</w:t>
+            </w:r>
+            <w:r>
+              <w:rPr>
+                <w:rFonts w:ascii="Verdana" w:eastAsia="Verdana" w:hAnsi="Verdana" w:cs="Verdana"/>
+                <w:sz w:val="24"/>
+                <w:szCs w:val="24"/>
+              </w:rPr>
+              <w:t>: Insert a future date or event during your lifetime, such as a court determination of your disability or a written determination by your physician that you are incapacitated, when you want this power to first take effect.)</w:t>
+            </w:r>
+          </w:p>
           <w:p>
             <w:pPr>
               <w:rPr>
@@ -5663,29 +6276,64 @@
                 <w:szCs w:val="24"/>
               </w:rPr>
             </w:pPr>
-            <w:r>
-              <w:rPr>
-                <w:rFonts w:ascii="Verdana" w:eastAsia="Verdana" w:hAnsi="Verdana" w:cs="Verdana"/>
-                <w:i/>
-                <w:iCs/>
-                <w:sz w:val="24"/>
-                <w:szCs w:val="24"/>
-              </w:rPr>
-              <w:t>(NOTA: Inserte una fecha futura o un evento durante su vida, como una determinación judicial de su discapacidad o una determinación por escrito de su médico en la que se indique que usted está incapacitado, cuando desee que este poder entre en vigor por primera vez).</w:t>
+          </w:p>
+        </w:tc>
+        <w:tc>
+          <w:tcPr>
+            <w:tcW w:w="4680" w:type="dxa"/>
+            <w:tcMar>
+              <w:top w:w="100" w:type="dxa"/>
+              <w:left w:w="100" w:type="dxa"/>
+              <w:bottom w:w="100" w:type="dxa"/>
+              <w:right w:w="100" w:type="dxa"/>
+            </w:tcMar>
+          </w:tcPr>
+          <w:p>
+            <w:pPr>
+              <w:rPr>
+                <w:rFonts w:ascii="Verdana" w:eastAsia="Verdana" w:hAnsi="Verdana" w:cs="Verdana"/>
+                <w:b/>
+                <w:bCs/>
+                <w:sz w:val="24"/>
+                <w:szCs w:val="24"/>
+              </w:rPr>
+            </w:pPr>
+            <w:r>
+              <w:rPr>
+                <w:rFonts w:ascii="Verdana" w:eastAsia="Verdana" w:hAnsi="Verdana" w:cs="Verdana"/>
+                <w:i/>
+                <w:iCs/>
+                <w:sz w:val="24"/>
+                <w:szCs w:val="24"/>
+              </w:rPr>
+              <w:t>(</w:t>
+            </w:r>
+            <w:r>
+              <w:rPr>
+                <w:rFonts w:ascii="Verdana" w:eastAsia="Verdana" w:hAnsi="Verdana" w:cs="Verdana"/>
+                <w:b/>
+                <w:bCs/>
+                <w:i/>
+                <w:iCs/>
+                <w:sz w:val="24"/>
+                <w:szCs w:val="24"/>
+              </w:rPr>
+              <w:t>NOTA</w:t>
+            </w:r>
+            <w:r>
+              <w:rPr>
+                <w:rFonts w:ascii="Verdana" w:eastAsia="Verdana" w:hAnsi="Verdana" w:cs="Verdana"/>
+                <w:i/>
+                <w:iCs/>
+                <w:sz w:val="24"/>
+                <w:szCs w:val="24"/>
+              </w:rPr>
+              <w:t>: Inserte una fecha futura o un evento durante su vida, como una determinación judicial de su discapacidad o una determinación por escrito de su médico en la que se indique que usted está incapacitado, cuando desee que este poder entre en vigor por primera vez).</w:t>
             </w:r>
           </w:p>
         </w:tc>
       </w:tr>
     </w:tbl>
-    <w:p>
-      <w:pPr>
-        <w:rPr>
-          <w:rFonts w:ascii="Verdana" w:eastAsia="Verdana" w:hAnsi="Verdana" w:cs="Verdana"/>
-          <w:sz w:val="24"/>
-          <w:szCs w:val="24"/>
-        </w:rPr>
-      </w:pPr>
-    </w:p>
     <w:p>
       <w:pPr>
         <w:rPr>
@@ -5952,7 +6600,8 @@
                 <w:sz w:val="24"/>
                 <w:szCs w:val="24"/>
               </w:rPr>
-              <w:t>{% if end_at_death == False %}{% if end_date_choice == “doctor” %}when my agent receives a note from my doctor that says I am capable of managing my financial affairs{% elif end_date_choice == “custody” %}when I have been released from custody{% elif end_date_choice == “immigration” %}once the Adverse Immigration Action is resolved and I confirm in writing my intent to resume managing my affairs. Resolution of the Adverse Immigration Action may include: execution or cancellation of a removal order, grant of immigration relief or protection, end of removal proceedings, or release from immigration detention{% elif end_date_choice == “other” %}on {{end_date_text}}{% endif %}{% else %}on my death{% endif %}.</w:t>
+              <w:lastRenderedPageBreak/>
+              <w:t>{% if end_at_death == False %}{% if end_date_choice == “doctor” %}when my agent receives a note from my doctor that says I am capable of managing my financial affairs{% elif end_date_choice == “custody” %}when I have been released from custody{% elif end_date_choice == “immigration” %}once the Adverse Immigration Action is resolved and I confirm in writing my intent to resume managing my affairs. Resolution of the Adverse Immigration Action may include: execution or cancellation of a removal order, grant of immigration relief or protection, end of removal proceedings, or release from immigration detention{% elif end_date_choice == “other” %}{{end_date_text}}{% endif %}{% else %}my death{% endif %}.</w:t>
             </w:r>
           </w:p>
         </w:tc>
@@ -6012,17 +6661,34 @@
                 <w:sz w:val="24"/>
                 <w:szCs w:val="24"/>
               </w:rPr>
-              <w:t>(NOTE: Insert a future date or event, such as a court determination that you are not under a legal disability or a written determination by your physician that you are not incapacitated, if</w:t>
-            </w:r>
-          </w:p>
-          <w:p>
-            <w:pPr>
-              <w:rPr>
-                <w:rFonts w:ascii="Verdana" w:eastAsia="Verdana" w:hAnsi="Verdana" w:cs="Verdana"/>
-                <w:sz w:val="24"/>
-                <w:szCs w:val="24"/>
-              </w:rPr>
-            </w:pPr>
+              <w:t>(</w:t>
+            </w:r>
+            <w:r>
+              <w:rPr>
+                <w:rFonts w:ascii="Verdana" w:eastAsia="Verdana" w:hAnsi="Verdana" w:cs="Verdana"/>
+                <w:b/>
+                <w:bCs/>
+                <w:sz w:val="24"/>
+                <w:szCs w:val="24"/>
+              </w:rPr>
+              <w:t>NOTE</w:t>
+            </w:r>
+            <w:r>
+              <w:rPr>
+                <w:rFonts w:ascii="Verdana" w:eastAsia="Verdana" w:hAnsi="Verdana" w:cs="Verdana"/>
+                <w:sz w:val="24"/>
+                <w:szCs w:val="24"/>
+              </w:rPr>
+              <w:t>: Insert a future date or event, such as a court determination that you are not under a legal disability or a written determination by your physician that you are not incapacitated, if</w:t>
+            </w:r>
+            <w:r>
+              <w:rPr>
+                <w:rFonts w:ascii="Verdana" w:eastAsia="Verdana" w:hAnsi="Verdana" w:cs="Verdana"/>
+                <w:sz w:val="24"/>
+                <w:szCs w:val="24"/>
+              </w:rPr>
+              <w:t xml:space="preserve"> </w:t>
+            </w:r>
             <w:r>
               <w:rPr>
                 <w:rFonts w:ascii="Verdana" w:eastAsia="Verdana" w:hAnsi="Verdana" w:cs="Verdana"/>
@@ -6090,129 +6756,159 @@
                 <w:sz w:val="24"/>
                 <w:szCs w:val="24"/>
               </w:rPr>
-              <w:t>(NOTA: Inserte una fecha o un evento futuro, como una determinación judicial de que usted ya no se encuentra bajo una discapacidad legal o una determinación por escrito de su médico de que usted no está incapacitado, si desea que este poder termine antes de su fallecimiento.)</w:t>
+              <w:t>(</w:t>
+            </w:r>
+            <w:r>
+              <w:rPr>
+                <w:rFonts w:ascii="Verdana" w:eastAsia="Verdana" w:hAnsi="Verdana" w:cs="Verdana"/>
+                <w:b/>
+                <w:bCs/>
+                <w:i/>
+                <w:iCs/>
+                <w:sz w:val="24"/>
+                <w:szCs w:val="24"/>
+              </w:rPr>
+              <w:t>NOTA</w:t>
+            </w:r>
+            <w:r>
+              <w:rPr>
+                <w:rFonts w:ascii="Verdana" w:eastAsia="Verdana" w:hAnsi="Verdana" w:cs="Verdana"/>
+                <w:i/>
+                <w:iCs/>
+                <w:sz w:val="24"/>
+                <w:szCs w:val="24"/>
+              </w:rPr>
+              <w:t>: Inserte una fecha o un evento futuro, como una determinación judicial de que usted ya no se encuentra bajo una discapacidad legal o una determinación por escrito de su médico de que usted no está incapacitado, si desea que este poder termine antes de su fallecimiento.)</w:t>
             </w:r>
           </w:p>
         </w:tc>
       </w:tr>
       <w:tr>
-        <w:tc>
-          <w:tcPr>
-            <w:tcW w:w="4680" w:type="dxa"/>
-            <w:tcMar>
-              <w:top w:w="100" w:type="dxa"/>
-              <w:left w:w="100" w:type="dxa"/>
-              <w:bottom w:w="100" w:type="dxa"/>
-              <w:right w:w="100" w:type="dxa"/>
-            </w:tcMar>
-          </w:tcPr>
-          <w:p>
-            <w:pPr>
-              <w:rPr>
-                <w:rFonts w:ascii="Verdana" w:eastAsia="Verdana" w:hAnsi="Verdana" w:cs="Verdana"/>
-                <w:sz w:val="24"/>
-                <w:szCs w:val="24"/>
-              </w:rPr>
-            </w:pPr>
-            <w:r>
-              <w:rPr>
-                <w:rFonts w:ascii="Verdana" w:eastAsia="Verdana" w:hAnsi="Verdana" w:cs="Verdana"/>
-                <w:sz w:val="24"/>
-                <w:szCs w:val="24"/>
-              </w:rPr>
-              <w:t>(NOTE: If you wish to name one or more successor agents, insert the name and address of each successor agent in paragraph 8.)</w:t>
-            </w:r>
-          </w:p>
-        </w:tc>
-        <w:tc>
-          <w:tcPr>
-            <w:tcW w:w="4680" w:type="dxa"/>
-            <w:tcMar>
-              <w:top w:w="100" w:type="dxa"/>
-              <w:left w:w="100" w:type="dxa"/>
-              <w:bottom w:w="100" w:type="dxa"/>
-              <w:right w:w="100" w:type="dxa"/>
-            </w:tcMar>
-          </w:tcPr>
-          <w:p>
-            <w:pPr>
-              <w:rPr>
-                <w:rFonts w:ascii="Verdana" w:eastAsia="Verdana" w:hAnsi="Verdana" w:cs="Verdana"/>
-                <w:i/>
-                <w:iCs/>
-                <w:sz w:val="24"/>
-                <w:szCs w:val="24"/>
-              </w:rPr>
-            </w:pPr>
-            <w:r>
-              <w:rPr>
-                <w:rFonts w:ascii="Verdana" w:eastAsia="Verdana" w:hAnsi="Verdana" w:cs="Verdana"/>
-                <w:i/>
-                <w:iCs/>
-                <w:sz w:val="24"/>
-                <w:szCs w:val="24"/>
-              </w:rPr>
-              <w:t>(NOTA: Si desea nombrar a uno o más agentes sucesores, inserte el nombre y la dirección de cada agente sucesor en el párrafo 8).</w:t>
-            </w:r>
-          </w:p>
-        </w:tc>
-      </w:tr>
-      <w:tr>
-        <w:tc>
-          <w:tcPr>
-            <w:tcW w:w="4680" w:type="dxa"/>
-            <w:tcMar>
-              <w:top w:w="100" w:type="dxa"/>
-              <w:left w:w="100" w:type="dxa"/>
-              <w:bottom w:w="100" w:type="dxa"/>
-              <w:right w:w="100" w:type="dxa"/>
-            </w:tcMar>
-          </w:tcPr>
-          <w:p>
-            <w:pPr>
-              <w:rPr>
-                <w:rFonts w:ascii="Verdana" w:eastAsia="Verdana" w:hAnsi="Verdana" w:cs="Verdana"/>
-                <w:sz w:val="24"/>
-                <w:szCs w:val="24"/>
-              </w:rPr>
-            </w:pPr>
-          </w:p>
-        </w:tc>
-        <w:tc>
-          <w:tcPr>
-            <w:tcW w:w="4680" w:type="dxa"/>
-            <w:tcMar>
-              <w:top w:w="100" w:type="dxa"/>
-              <w:left w:w="100" w:type="dxa"/>
-              <w:bottom w:w="100" w:type="dxa"/>
-              <w:right w:w="100" w:type="dxa"/>
-            </w:tcMar>
-          </w:tcPr>
-          <w:p>
-            <w:pPr>
-              <w:rPr>
-                <w:rFonts w:ascii="Verdana" w:eastAsia="Verdana" w:hAnsi="Verdana" w:cs="Verdana"/>
-                <w:i/>
-                <w:iCs/>
-                <w:sz w:val="24"/>
-                <w:szCs w:val="24"/>
-              </w:rPr>
-            </w:pPr>
+        <w:trPr>
+          <w:trHeight w:val="1437"/>
+        </w:trPr>
+        <w:tc>
+          <w:tcPr>
+            <w:tcW w:w="4680" w:type="dxa"/>
+            <w:tcMar>
+              <w:top w:w="100" w:type="dxa"/>
+              <w:left w:w="100" w:type="dxa"/>
+              <w:bottom w:w="100" w:type="dxa"/>
+              <w:right w:w="100" w:type="dxa"/>
+            </w:tcMar>
+          </w:tcPr>
+          <w:p>
+            <w:pPr>
+              <w:rPr>
+                <w:rFonts w:ascii="Verdana" w:eastAsia="Verdana" w:hAnsi="Verdana" w:cs="Verdana"/>
+                <w:sz w:val="24"/>
+                <w:szCs w:val="24"/>
+              </w:rPr>
+            </w:pPr>
+            <w:r>
+              <w:rPr>
+                <w:rFonts w:ascii="Verdana" w:eastAsia="Verdana" w:hAnsi="Verdana" w:cs="Verdana"/>
+                <w:sz w:val="24"/>
+                <w:szCs w:val="24"/>
+              </w:rPr>
+              <w:t>(</w:t>
+            </w:r>
+            <w:r>
+              <w:rPr>
+                <w:rFonts w:ascii="Verdana" w:eastAsia="Verdana" w:hAnsi="Verdana" w:cs="Verdana"/>
+                <w:b/>
+                <w:bCs/>
+                <w:sz w:val="24"/>
+                <w:szCs w:val="24"/>
+              </w:rPr>
+              <w:t>NOTE</w:t>
+            </w:r>
+            <w:r>
+              <w:rPr>
+                <w:rFonts w:ascii="Verdana" w:eastAsia="Verdana" w:hAnsi="Verdana" w:cs="Verdana"/>
+                <w:sz w:val="24"/>
+                <w:szCs w:val="24"/>
+              </w:rPr>
+              <w:t>: If you wish to name one or more successor agents, insert the name and address of each successor agent in paragraph 8.)</w:t>
+            </w:r>
+          </w:p>
+        </w:tc>
+        <w:tc>
+          <w:tcPr>
+            <w:tcW w:w="4680" w:type="dxa"/>
+            <w:tcMar>
+              <w:top w:w="100" w:type="dxa"/>
+              <w:left w:w="100" w:type="dxa"/>
+              <w:bottom w:w="100" w:type="dxa"/>
+              <w:right w:w="100" w:type="dxa"/>
+            </w:tcMar>
+          </w:tcPr>
+          <w:p>
+            <w:pPr>
+              <w:rPr>
+                <w:rFonts w:ascii="Verdana" w:eastAsia="Verdana" w:hAnsi="Verdana" w:cs="Verdana"/>
+                <w:i/>
+                <w:iCs/>
+                <w:sz w:val="24"/>
+                <w:szCs w:val="24"/>
+              </w:rPr>
+            </w:pPr>
+            <w:r>
+              <w:rPr>
+                <w:rFonts w:ascii="Verdana" w:eastAsia="Verdana" w:hAnsi="Verdana" w:cs="Verdana"/>
+                <w:i/>
+                <w:iCs/>
+                <w:sz w:val="24"/>
+                <w:szCs w:val="24"/>
+              </w:rPr>
+              <w:t>(</w:t>
+            </w:r>
+            <w:r>
+              <w:rPr>
+                <w:rFonts w:ascii="Verdana" w:eastAsia="Verdana" w:hAnsi="Verdana" w:cs="Verdana"/>
+                <w:b/>
+                <w:bCs/>
+                <w:i/>
+                <w:iCs/>
+                <w:sz w:val="24"/>
+                <w:szCs w:val="24"/>
+              </w:rPr>
+              <w:t>NOTA</w:t>
+            </w:r>
+            <w:r>
+              <w:rPr>
+                <w:rFonts w:ascii="Verdana" w:eastAsia="Verdana" w:hAnsi="Verdana" w:cs="Verdana"/>
+                <w:i/>
+                <w:iCs/>
+                <w:sz w:val="24"/>
+                <w:szCs w:val="24"/>
+              </w:rPr>
+              <w:t>: Si desea nombrar a uno o más agentes sucesores, inserte el nombre y la dirección de cada agente sucesor en el párrafo 8</w:t>
+            </w:r>
+            <w:r>
+              <w:rPr>
+                <w:rFonts w:ascii="Verdana" w:eastAsia="Verdana" w:hAnsi="Verdana" w:cs="Verdana"/>
+                <w:i/>
+                <w:iCs/>
+                <w:sz w:val="24"/>
+                <w:szCs w:val="24"/>
+              </w:rPr>
+              <w:t>.</w:t>
+            </w:r>
+            <w:r>
+              <w:rPr>
+                <w:rFonts w:ascii="Verdana" w:eastAsia="Verdana" w:hAnsi="Verdana" w:cs="Verdana"/>
+                <w:i/>
+                <w:iCs/>
+                <w:sz w:val="24"/>
+                <w:szCs w:val="24"/>
+              </w:rPr>
+              <w:t>)</w:t>
+            </w:r>
           </w:p>
         </w:tc>
       </w:tr>
     </w:tbl>
-    <w:p>
-      <w:pPr>
-        <w:rPr>
-          <w:rFonts w:ascii="Verdana" w:eastAsia="Verdana" w:hAnsi="Verdana" w:cs="Verdana"/>
-          <w:b/>
-          <w:bCs/>
-          <w:sz w:val="24"/>
-          <w:szCs w:val="24"/>
-        </w:rPr>
-      </w:pPr>
-    </w:p>
     <w:tbl>
       <w:tblPr>
         <w:tblStyle w:val="ab"/>
@@ -6372,7 +7068,6 @@
                 <w:sz w:val="24"/>
                 <w:szCs w:val="24"/>
               </w:rPr>
-              <w:lastRenderedPageBreak/>
               <w:t>{% if any_successors == True %}{% for person in successors %}</w:t>
             </w:r>
           </w:p>
@@ -6538,7 +7233,25 @@
                 <w:sz w:val="24"/>
                 <w:szCs w:val="24"/>
               </w:rPr>
-              <w:t xml:space="preserve">(NOTE: If you wish to, you may name your agent as guardian of your estate if a court decides that one should be appointed. To do this, retain paragraph 9, and the court will appoint your agent if the </w:t>
+              <w:t>(</w:t>
+            </w:r>
+            <w:r>
+              <w:rPr>
+                <w:rFonts w:ascii="Verdana" w:eastAsia="Verdana" w:hAnsi="Verdana" w:cs="Verdana"/>
+                <w:b/>
+                <w:bCs/>
+                <w:sz w:val="24"/>
+                <w:szCs w:val="24"/>
+              </w:rPr>
+              <w:t>NOTE</w:t>
+            </w:r>
+            <w:r>
+              <w:rPr>
+                <w:rFonts w:ascii="Verdana" w:eastAsia="Verdana" w:hAnsi="Verdana" w:cs="Verdana"/>
+                <w:sz w:val="24"/>
+                <w:szCs w:val="24"/>
+              </w:rPr>
+              <w:t xml:space="preserve">: If you wish to, you may name your agent as guardian of your estate if a court decides that one should be appointed. To do this, retain paragraph 9, and the court will appoint your agent if the </w:t>
             </w:r>
           </w:p>
           <w:p>
@@ -6587,7 +7300,29 @@
                 <w:sz w:val="24"/>
                 <w:szCs w:val="24"/>
               </w:rPr>
-              <w:t>(NOTA: Si lo desea, puede designar a su agente como tutor de su patrimonio si un tribunal decide que se debe nombrar a uno. Para ello, mantenga el párrafo 9, y el tribunal nombrará a su agente si determina que dicho nombramiento sería en su mejor interés y bienestar. Tache el párrafo 9 si no desea que su agente actúe como tutor).</w:t>
+              <w:t>(</w:t>
+            </w:r>
+            <w:r>
+              <w:rPr>
+                <w:rFonts w:ascii="Verdana" w:eastAsia="Verdana" w:hAnsi="Verdana" w:cs="Verdana"/>
+                <w:b/>
+                <w:bCs/>
+                <w:i/>
+                <w:iCs/>
+                <w:sz w:val="24"/>
+                <w:szCs w:val="24"/>
+              </w:rPr>
+              <w:t>NOTA</w:t>
+            </w:r>
+            <w:r>
+              <w:rPr>
+                <w:rFonts w:ascii="Verdana" w:eastAsia="Verdana" w:hAnsi="Verdana" w:cs="Verdana"/>
+                <w:i/>
+                <w:iCs/>
+                <w:sz w:val="24"/>
+                <w:szCs w:val="24"/>
+              </w:rPr>
+              <w:t>: Si lo desea, puede designar a su agente como tutor de su patrimonio si un tribunal decide que se debe nombrar a uno. Para ello, mantenga el párrafo 9, y el tribunal nombrará a su agente si determina que dicho nombramiento sería en su mejor interés y bienestar. Tache el párrafo 9 si no desea que su agente actúe como tutor).</w:t>
             </w:r>
           </w:p>
         </w:tc>
@@ -6637,7 +7372,16 @@
                 <w:sz w:val="24"/>
                 <w:szCs w:val="24"/>
               </w:rPr>
-              <w:t>{% if is_guardian == True %}If a guardian of my estate (my property) is to be appointed, I nominate the agent acting under this power of attorney as such guardian, to serve without bond or security.{% else %}</w:t>
+              <w:t xml:space="preserve">{% if is_guardian == True %}If a guardian of my estate (my property) is to be appointed, I nominate the agent acting under this power of attorney as such guardian, to serve without bond or </w:t>
+            </w:r>
+            <w:r>
+              <w:rPr>
+                <w:rFonts w:ascii="Verdana" w:eastAsia="Verdana" w:hAnsi="Verdana" w:cs="Verdana"/>
+                <w:sz w:val="24"/>
+                <w:szCs w:val="24"/>
+              </w:rPr>
+              <w:lastRenderedPageBreak/>
+              <w:t>security.{% else %}</w:t>
             </w:r>
             <w:r>
               <w:rPr>
@@ -6646,17 +7390,7 @@
                 <w:sz w:val="24"/>
                 <w:szCs w:val="24"/>
               </w:rPr>
-              <w:t xml:space="preserve">If a guardian of </w:t>
-            </w:r>
-            <w:r>
-              <w:rPr>
-                <w:rFonts w:ascii="Verdana" w:eastAsia="Verdana" w:hAnsi="Verdana" w:cs="Verdana"/>
-                <w:strike/>
-                <w:sz w:val="24"/>
-                <w:szCs w:val="24"/>
-              </w:rPr>
-              <w:lastRenderedPageBreak/>
-              <w:t>my estate (my property) is to be appointed, I nominate the agent acting under this power of attorney as such guardian, to serve without bond or security.</w:t>
+              <w:t>If a guardian of my estate (my property) is to be appointed, I nominate the agent acting under this power of attorney as such guardian, to serve without bond or security.</w:t>
             </w:r>
             <w:r>
               <w:rPr>
@@ -6717,7 +7451,18 @@
                 <w:sz w:val="24"/>
                 <w:szCs w:val="24"/>
               </w:rPr>
-              <w:t>{% if is_guardian == True %}Si se designa un tutor de mi patrimonio (mis bienes), designo como tal al agente que actúe en virtud de este poder notarial, para que ejerza sus funciones sin fianza ni garantía.{% else %}</w:t>
+              <w:t xml:space="preserve">{% if is_guardian == True %}Si se designa un tutor de mi patrimonio (mis bienes), designo como tal al agente que actúe en virtud de este poder notarial, para que ejerza sus funciones sin fianza </w:t>
+            </w:r>
+            <w:r>
+              <w:rPr>
+                <w:rFonts w:ascii="Verdana" w:eastAsia="Verdana" w:hAnsi="Verdana" w:cs="Verdana"/>
+                <w:i/>
+                <w:iCs/>
+                <w:sz w:val="24"/>
+                <w:szCs w:val="24"/>
+              </w:rPr>
+              <w:lastRenderedPageBreak/>
+              <w:t>ni garantía.{% else %}</w:t>
             </w:r>
             <w:r>
               <w:rPr>
@@ -6728,19 +7473,7 @@
                 <w:sz w:val="24"/>
                 <w:szCs w:val="24"/>
               </w:rPr>
-              <w:t xml:space="preserve">Si se designa </w:t>
-            </w:r>
-            <w:r>
-              <w:rPr>
-                <w:rFonts w:ascii="Verdana" w:eastAsia="Verdana" w:hAnsi="Verdana" w:cs="Verdana"/>
-                <w:i/>
-                <w:iCs/>
-                <w:strike/>
-                <w:sz w:val="24"/>
-                <w:szCs w:val="24"/>
-              </w:rPr>
-              <w:lastRenderedPageBreak/>
-              <w:t>un tutor de mi patrimonio (mis bienes), designo como tal al agente que actúe en virtud de este poder notarial, para que ejerza sus funciones sin fianza ni garantía.</w:t>
+              <w:t>Si se designa un tutor de mi patrimonio (mis bienes), designo como tal al agente que actúe en virtud de este poder notarial, para que ejerza sus funciones sin fianza ni garantía.</w:t>
             </w:r>
             <w:r>
               <w:rPr>
@@ -6867,22 +7600,9 @@
                 <w:sz w:val="24"/>
                 <w:szCs w:val="24"/>
               </w:rPr>
-              <w:t>(NOTE: This form does not authorize your agent to appear in court for you as an attorney-at-law or otherwise to engage in the practice of law unless he or she is a licensed attorney who is authorized to practice law in Illinois.)</w:t>
-            </w:r>
-          </w:p>
-        </w:tc>
-        <w:tc>
-          <w:tcPr>
-            <w:tcW w:w="4680" w:type="dxa"/>
-            <w:tcMar>
-              <w:top w:w="100" w:type="dxa"/>
-              <w:left w:w="100" w:type="dxa"/>
-              <w:bottom w:w="100" w:type="dxa"/>
-              <w:right w:w="100" w:type="dxa"/>
-            </w:tcMar>
-          </w:tcPr>
-          <w:p>
-            <w:pPr>
+              <w:t>(</w:t>
+            </w:r>
+            <w:r>
               <w:rPr>
                 <w:rFonts w:ascii="Verdana" w:eastAsia="Verdana" w:hAnsi="Verdana" w:cs="Verdana"/>
                 <w:b/>
@@ -6890,16 +7610,69 @@
                 <w:sz w:val="24"/>
                 <w:szCs w:val="24"/>
               </w:rPr>
-            </w:pPr>
-            <w:r>
-              <w:rPr>
-                <w:rFonts w:ascii="Verdana" w:eastAsia="Verdana" w:hAnsi="Verdana" w:cs="Verdana"/>
-                <w:i/>
-                <w:iCs/>
-                <w:sz w:val="24"/>
-                <w:szCs w:val="24"/>
-              </w:rPr>
-              <w:t>(NOTA: Este formulario no autoriza a su agente a comparecer ante los tribunales en su nombre como abogado ni a ejercer la abogacía, a menos que sea un abogado licenciado autorizado para ejercer la abogacía en Illinois).</w:t>
+              <w:t>NOTE</w:t>
+            </w:r>
+            <w:r>
+              <w:rPr>
+                <w:rFonts w:ascii="Verdana" w:eastAsia="Verdana" w:hAnsi="Verdana" w:cs="Verdana"/>
+                <w:sz w:val="24"/>
+                <w:szCs w:val="24"/>
+              </w:rPr>
+              <w:t>: This form does not authorize your agent to appear in court for you as an attorney-at-law or otherwise to engage in the practice of law unless he or she is a licensed attorney who is authorized to practice law in Illinois.)</w:t>
+            </w:r>
+          </w:p>
+        </w:tc>
+        <w:tc>
+          <w:tcPr>
+            <w:tcW w:w="4680" w:type="dxa"/>
+            <w:tcMar>
+              <w:top w:w="100" w:type="dxa"/>
+              <w:left w:w="100" w:type="dxa"/>
+              <w:bottom w:w="100" w:type="dxa"/>
+              <w:right w:w="100" w:type="dxa"/>
+            </w:tcMar>
+          </w:tcPr>
+          <w:p>
+            <w:pPr>
+              <w:rPr>
+                <w:rFonts w:ascii="Verdana" w:eastAsia="Verdana" w:hAnsi="Verdana" w:cs="Verdana"/>
+                <w:b/>
+                <w:bCs/>
+                <w:sz w:val="24"/>
+                <w:szCs w:val="24"/>
+              </w:rPr>
+            </w:pPr>
+            <w:r>
+              <w:rPr>
+                <w:rFonts w:ascii="Verdana" w:eastAsia="Verdana" w:hAnsi="Verdana" w:cs="Verdana"/>
+                <w:i/>
+                <w:iCs/>
+                <w:sz w:val="24"/>
+                <w:szCs w:val="24"/>
+              </w:rPr>
+              <w:t>(</w:t>
+            </w:r>
+            <w:r>
+              <w:rPr>
+                <w:rFonts w:ascii="Verdana" w:eastAsia="Verdana" w:hAnsi="Verdana" w:cs="Verdana"/>
+                <w:b/>
+                <w:bCs/>
+                <w:i/>
+                <w:iCs/>
+                <w:sz w:val="24"/>
+                <w:szCs w:val="24"/>
+              </w:rPr>
+              <w:t>NOTA</w:t>
+            </w:r>
+            <w:r>
+              <w:rPr>
+                <w:rFonts w:ascii="Verdana" w:eastAsia="Verdana" w:hAnsi="Verdana" w:cs="Verdana"/>
+                <w:i/>
+                <w:iCs/>
+                <w:sz w:val="24"/>
+                <w:szCs w:val="24"/>
+              </w:rPr>
+              <w:t>: Este formulario no autoriza a su agente a comparecer ante los tribunales en su nombre como abogado ni a ejercer la abogacía, a menos que sea un abogado licenciado autorizado para ejercer la abogacía en Illinois).</w:t>
             </w:r>
           </w:p>
         </w:tc>
@@ -7022,17 +7795,69 @@
               <w:widowControl w:val="0"/>
               <w:rPr>
                 <w:rFonts w:ascii="Verdana" w:eastAsia="Verdana" w:hAnsi="Verdana" w:cs="Verdana"/>
-                <w:sz w:val="24"/>
-                <w:szCs w:val="24"/>
-              </w:rPr>
-            </w:pPr>
-          </w:p>
+                <w:b/>
+                <w:bCs/>
+                <w:sz w:val="24"/>
+                <w:szCs w:val="24"/>
+              </w:rPr>
+            </w:pPr>
+            <w:r>
+              <w:rPr>
+                <w:rFonts w:ascii="Verdana" w:eastAsia="Verdana" w:hAnsi="Verdana" w:cs="Verdana"/>
+                <w:sz w:val="24"/>
+                <w:szCs w:val="24"/>
+              </w:rPr>
+              <w:t>(</w:t>
+            </w:r>
+            <w:r>
+              <w:rPr>
+                <w:rFonts w:ascii="Verdana" w:eastAsia="Verdana" w:hAnsi="Verdana" w:cs="Verdana"/>
+                <w:b/>
+                <w:bCs/>
+                <w:sz w:val="24"/>
+                <w:szCs w:val="24"/>
+              </w:rPr>
+              <w:t>NOTE</w:t>
+            </w:r>
+            <w:r>
+              <w:rPr>
+                <w:rFonts w:ascii="Verdana" w:eastAsia="Verdana" w:hAnsi="Verdana" w:cs="Verdana"/>
+                <w:sz w:val="24"/>
+                <w:szCs w:val="24"/>
+              </w:rPr>
+              <w:t>: This form must be signed in front of a witness. Do not sign until your witness is present.)</w:t>
+            </w:r>
+          </w:p>
+        </w:tc>
+        <w:tc>
+          <w:tcPr>
+            <w:tcW w:w="4680" w:type="dxa"/>
+            <w:tcMar>
+              <w:top w:w="100" w:type="dxa"/>
+              <w:left w:w="100" w:type="dxa"/>
+              <w:bottom w:w="100" w:type="dxa"/>
+              <w:right w:w="100" w:type="dxa"/>
+            </w:tcMar>
+          </w:tcPr>
           <w:p>
             <w:pPr>
               <w:keepLines/>
               <w:widowControl w:val="0"/>
               <w:rPr>
                 <w:rFonts w:ascii="Verdana" w:eastAsia="Verdana" w:hAnsi="Verdana" w:cs="Verdana"/>
+                <w:i/>
+                <w:iCs/>
+                <w:sz w:val="24"/>
+                <w:szCs w:val="24"/>
+              </w:rPr>
+            </w:pPr>
+          </w:p>
+          <w:p>
+            <w:pPr>
+              <w:keepLines/>
+              <w:widowControl w:val="0"/>
+              <w:rPr>
+                <w:rFonts w:ascii="Verdana" w:eastAsia="Verdana" w:hAnsi="Verdana" w:cs="Verdana"/>
                 <w:b/>
                 <w:bCs/>
                 <w:sz w:val="24"/>
@@ -7042,22 +7867,74 @@
             <w:r>
               <w:rPr>
                 <w:rFonts w:ascii="Verdana" w:eastAsia="Verdana" w:hAnsi="Verdana" w:cs="Verdana"/>
-                <w:sz w:val="24"/>
-                <w:szCs w:val="24"/>
-              </w:rPr>
-              <w:t>(NOTE: This form must be signed in front of a witness. Do not sign until your witness is present.)</w:t>
-            </w:r>
-          </w:p>
-        </w:tc>
-        <w:tc>
-          <w:tcPr>
-            <w:tcW w:w="4680" w:type="dxa"/>
-            <w:tcMar>
-              <w:top w:w="100" w:type="dxa"/>
-              <w:left w:w="100" w:type="dxa"/>
-              <w:bottom w:w="100" w:type="dxa"/>
-              <w:right w:w="100" w:type="dxa"/>
-            </w:tcMar>
+                <w:i/>
+                <w:iCs/>
+                <w:sz w:val="24"/>
+                <w:szCs w:val="24"/>
+              </w:rPr>
+              <w:t>(</w:t>
+            </w:r>
+            <w:r>
+              <w:rPr>
+                <w:rFonts w:ascii="Verdana" w:eastAsia="Verdana" w:hAnsi="Verdana" w:cs="Verdana"/>
+                <w:b/>
+                <w:bCs/>
+                <w:i/>
+                <w:iCs/>
+                <w:sz w:val="24"/>
+                <w:szCs w:val="24"/>
+              </w:rPr>
+              <w:t>NOTA</w:t>
+            </w:r>
+            <w:r>
+              <w:rPr>
+                <w:rFonts w:ascii="Verdana" w:eastAsia="Verdana" w:hAnsi="Verdana" w:cs="Verdana"/>
+                <w:i/>
+                <w:iCs/>
+                <w:sz w:val="24"/>
+                <w:szCs w:val="24"/>
+              </w:rPr>
+              <w:t>: Este formulario debe firmarse en presencia de un testigo. No firme hasta que el testigo esté presente.)</w:t>
+            </w:r>
+          </w:p>
+        </w:tc>
+      </w:tr>
+    </w:tbl>
+    <w:p>
+      <w:pPr>
+        <w:keepLines/>
+        <w:widowControl w:val="0"/>
+        <w:rPr>
+          <w:rFonts w:ascii="Verdana" w:eastAsia="Verdana" w:hAnsi="Verdana" w:cs="Verdana"/>
+          <w:sz w:val="24"/>
+          <w:szCs w:val="24"/>
+        </w:rPr>
+      </w:pPr>
+    </w:p>
+    <w:tbl>
+      <w:tblPr>
+        <w:tblStyle w:val="TableGrid"/>
+        <w:tblW w:w="0" w:type="auto"/>
+        <w:tblBorders>
+          <w:top w:val="none" w:sz="0" w:space="0" w:color="auto"/>
+          <w:left w:val="none" w:sz="0" w:space="0" w:color="auto"/>
+          <w:bottom w:val="none" w:sz="0" w:space="0" w:color="auto"/>
+          <w:right w:val="none" w:sz="0" w:space="0" w:color="auto"/>
+          <w:insideH w:val="none" w:sz="0" w:space="0" w:color="auto"/>
+          <w:insideV w:val="none" w:sz="0" w:space="0" w:color="auto"/>
+        </w:tblBorders>
+        <w:tblLook w:val="04A0" w:firstRow="1" w:lastRow="0" w:firstColumn="1" w:lastColumn="0" w:noHBand="0" w:noVBand="1"/>
+      </w:tblPr>
+      <w:tblGrid>
+        <w:gridCol w:w="1260"/>
+        <w:gridCol w:w="1795"/>
+        <w:gridCol w:w="2430"/>
+        <w:gridCol w:w="3865"/>
+      </w:tblGrid>
+      <w:tr>
+        <w:tc>
+          <w:tcPr>
+            <w:tcW w:w="1260" w:type="dxa"/>
           </w:tcPr>
           <w:p>
             <w:pPr>
@@ -7065,47 +7942,232 @@
               <w:widowControl w:val="0"/>
               <w:rPr>
                 <w:rFonts w:ascii="Verdana" w:eastAsia="Verdana" w:hAnsi="Verdana" w:cs="Verdana"/>
-                <w:i/>
-                <w:iCs/>
-                <w:sz w:val="24"/>
-                <w:szCs w:val="24"/>
-              </w:rPr>
-            </w:pPr>
-          </w:p>
+                <w:sz w:val="24"/>
+                <w:szCs w:val="24"/>
+              </w:rPr>
+            </w:pPr>
+            <w:r>
+              <w:rPr>
+                <w:rFonts w:ascii="Verdana" w:eastAsia="Verdana" w:hAnsi="Verdana" w:cs="Verdana"/>
+                <w:sz w:val="24"/>
+                <w:szCs w:val="24"/>
+              </w:rPr>
+              <w:t xml:space="preserve">Dated / </w:t>
+            </w:r>
+          </w:p>
+        </w:tc>
+        <w:tc>
+          <w:tcPr>
+            <w:tcW w:w="1795" w:type="dxa"/>
+            <w:tcBorders>
+              <w:bottom w:val="single" w:sz="4" w:space="0" w:color="auto"/>
+            </w:tcBorders>
+          </w:tcPr>
           <w:p>
             <w:pPr>
               <w:keepLines/>
               <w:widowControl w:val="0"/>
               <w:rPr>
                 <w:rFonts w:ascii="Verdana" w:eastAsia="Verdana" w:hAnsi="Verdana" w:cs="Verdana"/>
-                <w:i/>
-                <w:iCs/>
-                <w:sz w:val="24"/>
-                <w:szCs w:val="24"/>
-              </w:rPr>
-            </w:pPr>
-          </w:p>
+                <w:sz w:val="24"/>
+                <w:szCs w:val="24"/>
+              </w:rPr>
+            </w:pPr>
+          </w:p>
+        </w:tc>
+        <w:tc>
+          <w:tcPr>
+            <w:tcW w:w="2430" w:type="dxa"/>
+          </w:tcPr>
           <w:p>
             <w:pPr>
               <w:keepLines/>
               <w:widowControl w:val="0"/>
               <w:rPr>
                 <w:rFonts w:ascii="Verdana" w:eastAsia="Verdana" w:hAnsi="Verdana" w:cs="Verdana"/>
-                <w:b/>
-                <w:bCs/>
-                <w:sz w:val="24"/>
-                <w:szCs w:val="24"/>
-              </w:rPr>
-            </w:pPr>
-            <w:r>
-              <w:rPr>
-                <w:rFonts w:ascii="Verdana" w:eastAsia="Verdana" w:hAnsi="Verdana" w:cs="Verdana"/>
-                <w:i/>
-                <w:iCs/>
-                <w:sz w:val="24"/>
-                <w:szCs w:val="24"/>
-              </w:rPr>
-              <w:t>(NOTA: Este formulario debe firmarse en presencia de un testigo. No firme hasta que el testigo esté presente.)</w:t>
+                <w:sz w:val="24"/>
+                <w:szCs w:val="24"/>
+              </w:rPr>
+            </w:pPr>
+            <w:r>
+              <w:rPr>
+                <w:rFonts w:ascii="Verdana" w:eastAsia="Verdana" w:hAnsi="Verdana" w:cs="Verdana"/>
+                <w:sz w:val="24"/>
+                <w:szCs w:val="24"/>
+              </w:rPr>
+              <w:t xml:space="preserve">Signed / </w:t>
+            </w:r>
+            <w:r>
+              <w:rPr>
+                <w:rFonts w:ascii="Verdana" w:eastAsia="Verdana" w:hAnsi="Verdana" w:cs="Verdana"/>
+                <w:i/>
+                <w:iCs/>
+                <w:sz w:val="24"/>
+                <w:szCs w:val="24"/>
+              </w:rPr>
+              <w:t>Firmado</w:t>
+            </w:r>
+            <w:r>
+              <w:rPr>
+                <w:rFonts w:ascii="Verdana" w:eastAsia="Verdana" w:hAnsi="Verdana" w:cs="Verdana"/>
+                <w:sz w:val="24"/>
+                <w:szCs w:val="24"/>
+              </w:rPr>
+              <w:t>:</w:t>
+            </w:r>
+          </w:p>
+        </w:tc>
+        <w:tc>
+          <w:tcPr>
+            <w:tcW w:w="3865" w:type="dxa"/>
+            <w:tcBorders>
+              <w:bottom w:val="single" w:sz="4" w:space="0" w:color="auto"/>
+            </w:tcBorders>
+          </w:tcPr>
+          <w:p>
+            <w:pPr>
+              <w:keepLines/>
+              <w:widowControl w:val="0"/>
+              <w:rPr>
+                <w:rFonts w:ascii="Verdana" w:eastAsia="Verdana" w:hAnsi="Verdana" w:cs="Verdana"/>
+                <w:sz w:val="24"/>
+                <w:szCs w:val="24"/>
+              </w:rPr>
+            </w:pPr>
+          </w:p>
+        </w:tc>
+      </w:tr>
+      <w:tr>
+        <w:tc>
+          <w:tcPr>
+            <w:tcW w:w="1260" w:type="dxa"/>
+          </w:tcPr>
+          <w:p>
+            <w:pPr>
+              <w:keepLines/>
+              <w:widowControl w:val="0"/>
+              <w:rPr>
+                <w:rFonts w:ascii="Verdana" w:eastAsia="Verdana" w:hAnsi="Verdana" w:cs="Verdana"/>
+                <w:sz w:val="24"/>
+                <w:szCs w:val="24"/>
+              </w:rPr>
+            </w:pPr>
+            <w:r>
+              <w:rPr>
+                <w:rFonts w:ascii="Verdana" w:eastAsia="Verdana" w:hAnsi="Verdana" w:cs="Verdana"/>
+                <w:i/>
+                <w:iCs/>
+                <w:sz w:val="24"/>
+                <w:szCs w:val="24"/>
+              </w:rPr>
+              <w:t>Fecha</w:t>
+            </w:r>
+            <w:r>
+              <w:rPr>
+                <w:rFonts w:ascii="Verdana" w:eastAsia="Verdana" w:hAnsi="Verdana" w:cs="Verdana"/>
+                <w:sz w:val="24"/>
+                <w:szCs w:val="24"/>
+              </w:rPr>
+              <w:t>:</w:t>
+            </w:r>
+          </w:p>
+        </w:tc>
+        <w:tc>
+          <w:tcPr>
+            <w:tcW w:w="1795" w:type="dxa"/>
+            <w:tcBorders>
+              <w:top w:val="single" w:sz="4" w:space="0" w:color="auto"/>
+            </w:tcBorders>
+          </w:tcPr>
+          <w:p>
+            <w:pPr>
+              <w:keepLines/>
+              <w:widowControl w:val="0"/>
+              <w:rPr>
+                <w:rFonts w:ascii="Verdana" w:eastAsia="Verdana" w:hAnsi="Verdana" w:cs="Verdana"/>
+                <w:sz w:val="24"/>
+                <w:szCs w:val="24"/>
+              </w:rPr>
+            </w:pPr>
+          </w:p>
+        </w:tc>
+        <w:tc>
+          <w:tcPr>
+            <w:tcW w:w="2430" w:type="dxa"/>
+          </w:tcPr>
+          <w:p>
+            <w:pPr>
+              <w:keepLines/>
+              <w:widowControl w:val="0"/>
+              <w:rPr>
+                <w:rFonts w:ascii="Verdana" w:eastAsia="Verdana" w:hAnsi="Verdana" w:cs="Verdana"/>
+                <w:sz w:val="24"/>
+                <w:szCs w:val="24"/>
+              </w:rPr>
+            </w:pPr>
+          </w:p>
+        </w:tc>
+        <w:tc>
+          <w:tcPr>
+            <w:tcW w:w="3865" w:type="dxa"/>
+            <w:tcBorders>
+              <w:top w:val="single" w:sz="4" w:space="0" w:color="auto"/>
+            </w:tcBorders>
+          </w:tcPr>
+          <w:p>
+            <w:pPr>
+              <w:keepLines/>
+              <w:widowControl w:val="0"/>
+              <w:rPr>
+                <w:rFonts w:ascii="Verdana" w:eastAsia="Verdana" w:hAnsi="Verdana" w:cs="Verdana"/>
+                <w:sz w:val="24"/>
+                <w:szCs w:val="24"/>
+              </w:rPr>
+            </w:pPr>
+            <w:r>
+              <w:rPr>
+                <w:rFonts w:ascii="Verdana" w:eastAsia="Verdana" w:hAnsi="Verdana" w:cs="Verdana"/>
+                <w:sz w:val="24"/>
+                <w:szCs w:val="24"/>
+              </w:rPr>
+              <w:t>{{principal.name_full()}}</w:t>
+            </w:r>
+          </w:p>
+          <w:p>
+            <w:pPr>
+              <w:keepLines/>
+              <w:widowControl w:val="0"/>
+              <w:rPr>
+                <w:rFonts w:ascii="Verdana" w:eastAsia="Verdana" w:hAnsi="Verdana" w:cs="Verdana"/>
+                <w:sz w:val="24"/>
+                <w:szCs w:val="24"/>
+              </w:rPr>
+            </w:pPr>
+            <w:r>
+              <w:rPr>
+                <w:rFonts w:ascii="Verdana" w:eastAsia="Verdana" w:hAnsi="Verdana" w:cs="Verdana"/>
+                <w:sz w:val="24"/>
+                <w:szCs w:val="24"/>
+              </w:rPr>
+              <w:t xml:space="preserve">(Principal / </w:t>
+            </w:r>
+            <w:r>
+              <w:rPr>
+                <w:rFonts w:ascii="Verdana" w:eastAsia="Verdana" w:hAnsi="Verdana" w:cs="Verdana"/>
+                <w:i/>
+                <w:iCs/>
+                <w:sz w:val="24"/>
+                <w:szCs w:val="24"/>
+              </w:rPr>
+              <w:t>Firma del otorgante</w:t>
+            </w:r>
+            <w:r>
+              <w:rPr>
+                <w:rFonts w:ascii="Verdana" w:eastAsia="Verdana" w:hAnsi="Verdana" w:cs="Verdana"/>
+                <w:sz w:val="24"/>
+                <w:szCs w:val="24"/>
+              </w:rPr>
+              <w:t>)</w:t>
             </w:r>
           </w:p>
         </w:tc>
@@ -7113,328 +8175,17 @@
     </w:tbl>
     <w:p>
       <w:pPr>
-        <w:keepLines/>
-        <w:widowControl w:val="0"/>
-        <w:rPr>
-          <w:rFonts w:ascii="Verdana" w:eastAsia="Verdana" w:hAnsi="Verdana" w:cs="Verdana"/>
-          <w:sz w:val="24"/>
-          <w:szCs w:val="24"/>
-        </w:rPr>
-      </w:pPr>
-    </w:p>
-    <w:p>
-      <w:pPr>
-        <w:keepLines/>
-        <w:widowControl w:val="0"/>
-        <w:rPr>
-          <w:rFonts w:ascii="Verdana" w:eastAsia="Verdana" w:hAnsi="Verdana" w:cs="Verdana"/>
-          <w:sz w:val="24"/>
-          <w:szCs w:val="24"/>
-        </w:rPr>
-      </w:pPr>
-      <w:r>
-        <w:rPr>
-          <w:rFonts w:ascii="Verdana" w:eastAsia="Verdana" w:hAnsi="Verdana" w:cs="Verdana"/>
-          <w:sz w:val="24"/>
-          <w:szCs w:val="24"/>
-        </w:rPr>
-        <w:tab/>
-      </w:r>
-      <w:r>
-        <w:rPr>
-          <w:rFonts w:ascii="Verdana" w:eastAsia="Verdana" w:hAnsi="Verdana" w:cs="Verdana"/>
-          <w:sz w:val="24"/>
-          <w:szCs w:val="24"/>
-        </w:rPr>
-        <w:tab/>
-      </w:r>
-      <w:r>
-        <w:rPr>
-          <w:rFonts w:ascii="Verdana" w:eastAsia="Verdana" w:hAnsi="Verdana" w:cs="Verdana"/>
-          <w:sz w:val="24"/>
-          <w:szCs w:val="24"/>
-        </w:rPr>
-        <w:tab/>
-        <w:t xml:space="preserve">Signed / </w:t>
-      </w:r>
-      <w:r>
-        <w:rPr>
-          <w:rFonts w:ascii="Verdana" w:eastAsia="Verdana" w:hAnsi="Verdana" w:cs="Verdana"/>
-          <w:i/>
-          <w:iCs/>
-          <w:sz w:val="24"/>
-          <w:szCs w:val="24"/>
-        </w:rPr>
-        <w:t>Firmado</w:t>
-      </w:r>
-      <w:r>
-        <w:rPr>
-          <w:rFonts w:ascii="Verdana" w:eastAsia="Verdana" w:hAnsi="Verdana" w:cs="Verdana"/>
-          <w:sz w:val="24"/>
-          <w:szCs w:val="24"/>
-        </w:rPr>
-        <w:t>: _______________________________</w:t>
-      </w:r>
-    </w:p>
-    <w:p>
-      <w:pPr>
-        <w:keepLines/>
-        <w:widowControl w:val="0"/>
-        <w:rPr>
-          <w:rFonts w:ascii="Verdana" w:eastAsia="Verdana" w:hAnsi="Verdana" w:cs="Verdana"/>
-          <w:sz w:val="24"/>
-          <w:szCs w:val="24"/>
-        </w:rPr>
-      </w:pPr>
-      <w:r>
-        <w:rPr>
-          <w:rFonts w:ascii="Verdana" w:eastAsia="Verdana" w:hAnsi="Verdana" w:cs="Verdana"/>
-          <w:sz w:val="24"/>
-          <w:szCs w:val="24"/>
-        </w:rPr>
-        <w:tab/>
-      </w:r>
-      <w:r>
-        <w:rPr>
-          <w:rFonts w:ascii="Verdana" w:eastAsia="Verdana" w:hAnsi="Verdana" w:cs="Verdana"/>
-          <w:sz w:val="24"/>
-          <w:szCs w:val="24"/>
-        </w:rPr>
-        <w:tab/>
-      </w:r>
-      <w:r>
-        <w:rPr>
-          <w:rFonts w:ascii="Verdana" w:eastAsia="Verdana" w:hAnsi="Verdana" w:cs="Verdana"/>
-          <w:sz w:val="24"/>
-          <w:szCs w:val="24"/>
-        </w:rPr>
-        <w:tab/>
-      </w:r>
-      <w:r>
-        <w:rPr>
-          <w:rFonts w:ascii="Verdana" w:eastAsia="Verdana" w:hAnsi="Verdana" w:cs="Verdana"/>
-          <w:sz w:val="24"/>
-          <w:szCs w:val="24"/>
-        </w:rPr>
-        <w:tab/>
-      </w:r>
-      <w:r>
-        <w:rPr>
-          <w:rFonts w:ascii="Verdana" w:eastAsia="Verdana" w:hAnsi="Verdana" w:cs="Verdana"/>
-          <w:sz w:val="24"/>
-          <w:szCs w:val="24"/>
-        </w:rPr>
-        <w:tab/>
-      </w:r>
-      <w:r>
-        <w:rPr>
-          <w:rFonts w:ascii="Verdana" w:eastAsia="Verdana" w:hAnsi="Verdana" w:cs="Verdana"/>
-          <w:sz w:val="24"/>
-          <w:szCs w:val="24"/>
-        </w:rPr>
-        <w:tab/>
-        <w:t xml:space="preserve">  (Principal / </w:t>
-      </w:r>
-      <w:r>
-        <w:rPr>
-          <w:rFonts w:ascii="Verdana" w:eastAsia="Verdana" w:hAnsi="Verdana" w:cs="Verdana"/>
-          <w:i/>
-          <w:iCs/>
-          <w:sz w:val="24"/>
-          <w:szCs w:val="24"/>
-        </w:rPr>
-        <w:t>Firma del otorgante</w:t>
-      </w:r>
-      <w:r>
-        <w:rPr>
-          <w:rFonts w:ascii="Verdana" w:eastAsia="Verdana" w:hAnsi="Verdana" w:cs="Verdana"/>
-          <w:sz w:val="24"/>
-          <w:szCs w:val="24"/>
-        </w:rPr>
-        <w:t>)</w:t>
-      </w:r>
-    </w:p>
-    <w:p>
-      <w:pPr>
-        <w:keepLines/>
-        <w:widowControl w:val="0"/>
-        <w:rPr>
-          <w:rFonts w:ascii="Verdana" w:eastAsia="Verdana" w:hAnsi="Verdana" w:cs="Verdana"/>
-          <w:sz w:val="24"/>
-          <w:szCs w:val="24"/>
-        </w:rPr>
-      </w:pPr>
-    </w:p>
-    <w:p>
-      <w:pPr>
-        <w:keepLines/>
-        <w:widowControl w:val="0"/>
-        <w:rPr>
-          <w:rFonts w:ascii="Verdana" w:eastAsia="Verdana" w:hAnsi="Verdana" w:cs="Verdana"/>
-          <w:sz w:val="24"/>
-          <w:szCs w:val="24"/>
-        </w:rPr>
-      </w:pPr>
-      <w:r>
-        <w:rPr>
-          <w:rFonts w:ascii="Verdana" w:eastAsia="Verdana" w:hAnsi="Verdana" w:cs="Verdana"/>
-          <w:sz w:val="24"/>
-          <w:szCs w:val="24"/>
-        </w:rPr>
-        <w:tab/>
-      </w:r>
-      <w:r>
-        <w:rPr>
-          <w:rFonts w:ascii="Verdana" w:eastAsia="Verdana" w:hAnsi="Verdana" w:cs="Verdana"/>
-          <w:sz w:val="24"/>
-          <w:szCs w:val="24"/>
-        </w:rPr>
-        <w:tab/>
-      </w:r>
-      <w:r>
-        <w:rPr>
-          <w:rFonts w:ascii="Verdana" w:eastAsia="Verdana" w:hAnsi="Verdana" w:cs="Verdana"/>
-          <w:sz w:val="24"/>
-          <w:szCs w:val="24"/>
-        </w:rPr>
-        <w:tab/>
-        <w:t xml:space="preserve">Dated / </w:t>
-      </w:r>
-      <w:r>
-        <w:rPr>
-          <w:rFonts w:ascii="Verdana" w:eastAsia="Verdana" w:hAnsi="Verdana" w:cs="Verdana"/>
-          <w:i/>
-          <w:iCs/>
-          <w:sz w:val="24"/>
-          <w:szCs w:val="24"/>
-        </w:rPr>
-        <w:t>Fecha</w:t>
-      </w:r>
-      <w:r>
-        <w:rPr>
-          <w:rFonts w:ascii="Verdana" w:eastAsia="Verdana" w:hAnsi="Verdana" w:cs="Verdana"/>
-          <w:sz w:val="24"/>
-          <w:szCs w:val="24"/>
-        </w:rPr>
-        <w:t>:________________</w:t>
-      </w:r>
-      <w:r>
-        <w:rPr>
-          <w:rFonts w:ascii="Verdana" w:eastAsia="Verdana" w:hAnsi="Verdana" w:cs="Verdana"/>
-          <w:sz w:val="24"/>
-          <w:szCs w:val="24"/>
-        </w:rPr>
-        <w:t>____________</w:t>
-      </w:r>
-      <w:r>
-        <w:rPr>
-          <w:rFonts w:ascii="Verdana" w:eastAsia="Verdana" w:hAnsi="Verdana" w:cs="Verdana"/>
-          <w:sz w:val="24"/>
-          <w:szCs w:val="24"/>
-        </w:rPr>
-        <w:t>______</w:t>
-      </w:r>
-    </w:p>
-    <w:p>
-      <w:pPr>
-        <w:rPr>
-          <w:rFonts w:ascii="Verdana" w:eastAsia="Verdana" w:hAnsi="Verdana" w:cs="Verdana"/>
-          <w:sz w:val="24"/>
-          <w:szCs w:val="24"/>
-        </w:rPr>
-      </w:pPr>
-    </w:p>
-    <w:p>
-      <w:pPr>
-        <w:rPr>
-          <w:rFonts w:ascii="Verdana" w:eastAsia="Verdana" w:hAnsi="Verdana" w:cs="Verdana"/>
-          <w:b/>
-          <w:bCs/>
-          <w:sz w:val="24"/>
-          <w:szCs w:val="24"/>
-          <w:u w:val="single"/>
-        </w:rPr>
-      </w:pPr>
-      <w:r>
-        <w:br w:type="page"/>
-      </w:r>
-    </w:p>
-    <w:p>
-      <w:pPr>
-        <w:jc w:val="center"/>
-        <w:rPr>
-          <w:rFonts w:ascii="Verdana" w:eastAsia="Verdana" w:hAnsi="Verdana" w:cs="Verdana"/>
-          <w:b/>
-          <w:bCs/>
-          <w:u w:val="single"/>
-        </w:rPr>
-      </w:pPr>
-      <w:r>
-        <w:rPr>
-          <w:rFonts w:ascii="Verdana" w:eastAsia="Verdana" w:hAnsi="Verdana" w:cs="Verdana"/>
-          <w:b/>
-          <w:bCs/>
-          <w:u w:val="single"/>
-        </w:rPr>
-        <w:lastRenderedPageBreak/>
-        <w:t>WITNESS(ES)</w:t>
-      </w:r>
-      <w:r>
-        <w:rPr>
-          <w:rFonts w:ascii="Verdana" w:eastAsia="Verdana" w:hAnsi="Verdana" w:cs="Verdana"/>
-          <w:b/>
-          <w:bCs/>
-          <w:u w:val="single"/>
-        </w:rPr>
-        <w:t xml:space="preserve"> </w:t>
-      </w:r>
-      <w:r>
-        <w:rPr>
-          <w:rFonts w:ascii="Verdana" w:eastAsia="Verdana" w:hAnsi="Verdana" w:cs="Verdana"/>
-          <w:b/>
-          <w:bCs/>
-          <w:u w:val="single"/>
-        </w:rPr>
-        <w:t>/</w:t>
-      </w:r>
-      <w:r>
-        <w:rPr>
-          <w:rFonts w:ascii="Verdana" w:eastAsia="Verdana" w:hAnsi="Verdana" w:cs="Verdana"/>
-          <w:b/>
-          <w:bCs/>
-          <w:u w:val="single"/>
-        </w:rPr>
-        <w:t xml:space="preserve"> </w:t>
-      </w:r>
-      <w:r>
-        <w:rPr>
-          <w:rFonts w:ascii="Verdana" w:eastAsia="Verdana" w:hAnsi="Verdana" w:cs="Verdana"/>
-          <w:b/>
-          <w:bCs/>
-          <w:u w:val="single"/>
-        </w:rPr>
-        <w:t>TESTIGO(S)</w:t>
-      </w:r>
-    </w:p>
-    <w:p>
-      <w:pPr>
-        <w:jc w:val="center"/>
-        <w:rPr>
-          <w:rFonts w:ascii="Verdana" w:eastAsia="Verdana" w:hAnsi="Verdana" w:cs="Verdana"/>
-          <w:b/>
-          <w:bCs/>
-          <w:sz w:val="20"/>
-          <w:szCs w:val="20"/>
-          <w:u w:val="single"/>
+        <w:rPr>
+          <w:rFonts w:ascii="Verdana" w:eastAsia="Verdana" w:hAnsi="Verdana" w:cs="Verdana"/>
+          <w:sz w:val="24"/>
+          <w:szCs w:val="24"/>
         </w:rPr>
       </w:pPr>
     </w:p>
     <w:tbl>
       <w:tblPr>
-        <w:tblStyle w:val="ad"/>
         <w:tblW w:w="9980" w:type="dxa"/>
         <w:jc w:val="center"/>
-        <w:tblInd w:w="0" w:type="dxa"/>
         <w:tblBorders>
           <w:top w:val="single" w:sz="8" w:space="0" w:color="FFFFFF"/>
           <w:left w:val="single" w:sz="8" w:space="0" w:color="FFFFFF"/>
@@ -7474,7 +8225,28 @@
               <w:rPr>
                 <w:rFonts w:ascii="Verdana" w:eastAsia="Verdana" w:hAnsi="Verdana" w:cs="Verdana"/>
               </w:rPr>
-              <w:t>(NOTE: This power of attorney will not be effective unless it is signed by at least one witness and your signature is notarized, using the form below. The notary may not also sign as a witness.)</w:t>
+              <w:t>(</w:t>
+            </w:r>
+            <w:r>
+              <w:rPr>
+                <w:rFonts w:ascii="Verdana" w:eastAsia="Verdana" w:hAnsi="Verdana" w:cs="Verdana"/>
+                <w:b/>
+                <w:bCs/>
+              </w:rPr>
+              <w:t>NOTE</w:t>
+            </w:r>
+            <w:r>
+              <w:rPr>
+                <w:rFonts w:ascii="Verdana" w:eastAsia="Verdana" w:hAnsi="Verdana" w:cs="Verdana"/>
+              </w:rPr>
+              <w:t xml:space="preserve">: This power of attorney will not be effective unless it is signed by at least one witness and your signature is notarized, </w:t>
+            </w:r>
+            <w:r>
+              <w:rPr>
+                <w:rFonts w:ascii="Verdana" w:eastAsia="Verdana" w:hAnsi="Verdana" w:cs="Verdana"/>
+              </w:rPr>
+              <w:lastRenderedPageBreak/>
+              <w:t>using the form below. The notary may not also sign as a witness.)</w:t>
             </w:r>
           </w:p>
           <w:p>
@@ -7517,7 +8289,35 @@
                 <w:i/>
                 <w:iCs/>
               </w:rPr>
-              <w:t>(NOTA: Este poder notarial no será válido a menos que esté firmado por al menos un testigo y su firma esté certificada por un notario, utilizando el formulario que figura a continuación. El notario no puede firmar también como testigo).</w:t>
+              <w:lastRenderedPageBreak/>
+              <w:t>(</w:t>
+            </w:r>
+            <w:r>
+              <w:rPr>
+                <w:rFonts w:ascii="Verdana" w:eastAsia="Verdana" w:hAnsi="Verdana" w:cs="Verdana"/>
+                <w:b/>
+                <w:bCs/>
+                <w:i/>
+                <w:iCs/>
+              </w:rPr>
+              <w:t>NOTA</w:t>
+            </w:r>
+            <w:r>
+              <w:rPr>
+                <w:rFonts w:ascii="Verdana" w:eastAsia="Verdana" w:hAnsi="Verdana" w:cs="Verdana"/>
+                <w:i/>
+                <w:iCs/>
+              </w:rPr>
+              <w:t xml:space="preserve">: Este poder notarial no será válido a menos que esté firmado por al menos un testigo y su firma esté certificada por un </w:t>
+            </w:r>
+            <w:r>
+              <w:rPr>
+                <w:rFonts w:ascii="Verdana" w:eastAsia="Verdana" w:hAnsi="Verdana" w:cs="Verdana"/>
+                <w:i/>
+                <w:iCs/>
+              </w:rPr>
+              <w:lastRenderedPageBreak/>
+              <w:t>notario, utilizando el formulario que figura a continuación. El notario no puede firmar también como testigo).</w:t>
             </w:r>
           </w:p>
         </w:tc>
@@ -7530,33 +8330,51 @@
           <w:rFonts w:ascii="Verdana" w:eastAsia="Verdana" w:hAnsi="Verdana" w:cs="Verdana"/>
           <w:b/>
           <w:bCs/>
+          <w:sz w:val="20"/>
+          <w:szCs w:val="20"/>
           <w:u w:val="single"/>
         </w:rPr>
       </w:pPr>
-      <w:r>
+    </w:p>
+    <w:p>
+      <w:pPr>
+        <w:jc w:val="center"/>
         <w:rPr>
           <w:rFonts w:ascii="Verdana" w:eastAsia="Verdana" w:hAnsi="Verdana" w:cs="Verdana"/>
           <w:b/>
           <w:bCs/>
-          <w:u w:val="single"/>
-        </w:rPr>
-        <w:t>WITNESS 1 (Required) /</w:t>
-      </w:r>
+        </w:rPr>
+      </w:pPr>
       <w:r>
         <w:rPr>
           <w:rFonts w:ascii="Verdana" w:eastAsia="Verdana" w:hAnsi="Verdana" w:cs="Verdana"/>
           <w:b/>
           <w:bCs/>
-          <w:u w:val="single"/>
-        </w:rPr>
-        <w:t xml:space="preserve"> </w:t>
+        </w:rPr>
+        <w:br w:type="page"/>
       </w:r>
       <w:r>
         <w:rPr>
           <w:rFonts w:ascii="Verdana" w:eastAsia="Verdana" w:hAnsi="Verdana" w:cs="Verdana"/>
           <w:b/>
           <w:bCs/>
-          <w:u w:val="single"/>
+        </w:rPr>
+        <w:lastRenderedPageBreak/>
+        <w:t>WITNESS 1 (Required) /</w:t>
+      </w:r>
+      <w:r>
+        <w:rPr>
+          <w:rFonts w:ascii="Verdana" w:eastAsia="Verdana" w:hAnsi="Verdana" w:cs="Verdana"/>
+          <w:b/>
+          <w:bCs/>
+        </w:rPr>
+        <w:t xml:space="preserve"> </w:t>
+      </w:r>
+      <w:r>
+        <w:rPr>
+          <w:rFonts w:ascii="Verdana" w:eastAsia="Verdana" w:hAnsi="Verdana" w:cs="Verdana"/>
+          <w:b/>
+          <w:bCs/>
         </w:rPr>
         <w:t>TESTIGO 1 (Requerido)</w:t>
       </w:r>
@@ -7732,6 +8550,15 @@
               </w:rPr>
             </w:pPr>
           </w:p>
+          <w:p>
+            <w:pPr>
+              <w:keepNext/>
+              <w:keepLines/>
+              <w:rPr>
+                <w:rFonts w:eastAsia="Verdana"/>
+              </w:rPr>
+            </w:pPr>
+          </w:p>
         </w:tc>
         <w:tc>
           <w:tcPr>
@@ -7873,7 +8700,6 @@
           <w:bCs/>
           <w:sz w:val="24"/>
           <w:szCs w:val="24"/>
-          <w:u w:val="single"/>
         </w:rPr>
       </w:pPr>
       <w:r>
@@ -7883,7 +8709,6 @@
           <w:bCs/>
           <w:sz w:val="24"/>
           <w:szCs w:val="24"/>
-          <w:u w:val="single"/>
         </w:rPr>
         <w:lastRenderedPageBreak/>
         <w:t>WITNESS 2 (Optional) / TESTIGO 2 (Opcional)</w:t>
@@ -7934,7 +8759,25 @@
                 <w:sz w:val="24"/>
                 <w:szCs w:val="24"/>
               </w:rPr>
-              <w:t>(NOTE: Illinois requires only one witness, but other jurisdictions may require more than one witness. If you wish to have a second witness, have him or her certify and sign here:)</w:t>
+              <w:t>(</w:t>
+            </w:r>
+            <w:r>
+              <w:rPr>
+                <w:rFonts w:ascii="Verdana" w:eastAsia="Verdana" w:hAnsi="Verdana" w:cs="Verdana"/>
+                <w:b/>
+                <w:bCs/>
+                <w:sz w:val="24"/>
+                <w:szCs w:val="24"/>
+              </w:rPr>
+              <w:t>NOTE</w:t>
+            </w:r>
+            <w:r>
+              <w:rPr>
+                <w:rFonts w:ascii="Verdana" w:eastAsia="Verdana" w:hAnsi="Verdana" w:cs="Verdana"/>
+                <w:sz w:val="24"/>
+                <w:szCs w:val="24"/>
+              </w:rPr>
+              <w:t>: Illinois requires only one witness, but other jurisdictions may require more than one witness. If you wish to have a second witness, have him or her certify and sign here:)</w:t>
             </w:r>
           </w:p>
         </w:tc>
@@ -7964,7 +8807,29 @@
                 <w:sz w:val="24"/>
                 <w:szCs w:val="24"/>
               </w:rPr>
-              <w:t>(NOTA: Illinois solo exige un testigo, pero otras jurisdicciones o estados pueden exigir más de uno. Si desea contar con un segundo testigo, pídale que certifique y firme aquí:)</w:t>
+              <w:t>(</w:t>
+            </w:r>
+            <w:r>
+              <w:rPr>
+                <w:rFonts w:ascii="Verdana" w:eastAsia="Verdana" w:hAnsi="Verdana" w:cs="Verdana"/>
+                <w:b/>
+                <w:bCs/>
+                <w:i/>
+                <w:iCs/>
+                <w:sz w:val="24"/>
+                <w:szCs w:val="24"/>
+              </w:rPr>
+              <w:t>NOTA</w:t>
+            </w:r>
+            <w:r>
+              <w:rPr>
+                <w:rFonts w:ascii="Verdana" w:eastAsia="Verdana" w:hAnsi="Verdana" w:cs="Verdana"/>
+                <w:i/>
+                <w:iCs/>
+                <w:sz w:val="24"/>
+                <w:szCs w:val="24"/>
+              </w:rPr>
+              <w:t>: Illinois solo exige un testigo, pero otras jurisdicciones o estados pueden exigir más de uno. Si desea contar con un segundo testigo, pídale que certifique y firme aquí:)</w:t>
             </w:r>
           </w:p>
         </w:tc>
@@ -8141,6 +9006,15 @@
               </w:rPr>
             </w:pPr>
           </w:p>
+          <w:p>
+            <w:pPr>
+              <w:keepNext/>
+              <w:keepLines/>
+              <w:rPr>
+                <w:rFonts w:eastAsia="Verdana"/>
+              </w:rPr>
+            </w:pPr>
+          </w:p>
         </w:tc>
         <w:tc>
           <w:tcPr>
@@ -8279,7 +9153,6 @@
           <w:bCs/>
           <w:sz w:val="24"/>
           <w:szCs w:val="24"/>
-          <w:u w:val="single"/>
         </w:rPr>
       </w:pPr>
       <w:r>
@@ -8289,7 +9162,6 @@
           <w:bCs/>
           <w:sz w:val="24"/>
           <w:szCs w:val="24"/>
-          <w:u w:val="single"/>
         </w:rPr>
         <w:lastRenderedPageBreak/>
         <w:t xml:space="preserve">NOTARY (Required) </w:t>
@@ -8651,7 +9523,6 @@
           <w:bCs/>
           <w:sz w:val="24"/>
           <w:szCs w:val="24"/>
-          <w:u w:val="single"/>
         </w:rPr>
       </w:pPr>
       <w:r>
@@ -8661,7 +9532,6 @@
           <w:bCs/>
           <w:sz w:val="24"/>
           <w:szCs w:val="24"/>
-          <w:u w:val="single"/>
         </w:rPr>
         <w:lastRenderedPageBreak/>
         <w:t xml:space="preserve">SPECIMEN SIGNATURES (Optional) / </w:t>
@@ -8674,7 +9544,6 @@
           <w:rFonts w:ascii="Verdana" w:eastAsia="Verdana" w:hAnsi="Verdana" w:cs="Verdana"/>
           <w:sz w:val="24"/>
           <w:szCs w:val="24"/>
-          <w:u w:val="single"/>
         </w:rPr>
       </w:pPr>
       <w:r>
@@ -8684,7 +9553,6 @@
           <w:bCs/>
           <w:sz w:val="24"/>
           <w:szCs w:val="24"/>
-          <w:u w:val="single"/>
         </w:rPr>
         <w:t>FIRMAS DE MUESTRA (Opcional)</w:t>
       </w:r>
@@ -8743,37 +9611,77 @@
                 <w:sz w:val="24"/>
                 <w:szCs w:val="24"/>
               </w:rPr>
-              <w:t>(NOTE: You may, but are not required to, request your agent and successor agents to provide specimen signatures below. This can help institutions and businesses verify the identity of the agent when the Power of Attorney is used later. If you include your agent’s specimen signatures in this Power of Attorney, you must also sign on the line next to the signatures of the agents.             This section is optional and can be completed at a later date.)</w:t>
-            </w:r>
-          </w:p>
-        </w:tc>
-        <w:tc>
-          <w:tcPr>
-            <w:tcW w:w="4680" w:type="dxa"/>
-            <w:tcMar>
-              <w:top w:w="100" w:type="dxa"/>
-              <w:left w:w="100" w:type="dxa"/>
-              <w:bottom w:w="100" w:type="dxa"/>
-              <w:right w:w="100" w:type="dxa"/>
-            </w:tcMar>
-          </w:tcPr>
-          <w:p>
-            <w:pPr>
-              <w:rPr>
-                <w:rFonts w:ascii="Verdana" w:eastAsia="Verdana" w:hAnsi="Verdana" w:cs="Verdana"/>
-                <w:sz w:val="24"/>
-                <w:szCs w:val="24"/>
-              </w:rPr>
-            </w:pPr>
-            <w:r>
-              <w:rPr>
-                <w:rFonts w:ascii="Verdana" w:eastAsia="Verdana" w:hAnsi="Verdana" w:cs="Verdana"/>
-                <w:i/>
-                <w:iCs/>
-                <w:sz w:val="24"/>
-                <w:szCs w:val="24"/>
-              </w:rPr>
-              <w:t>(NOTA: Puede, pero no está obligado, a solicitar a su agente y a los agentes sucesores que proporcionen sus firmas de muestra a continuación. Esto puede ayudar a las instituciones y empresas a verificar la identidad del agente cuando se utilice este poder notarial. Si incluye las firmas de muestra de su agente en este poder notarial, también deberá firmar en la línea junto a las firmas de los agentes. Esta sección es opcional y puede completarse posteriormente.)</w:t>
+              <w:t>(</w:t>
+            </w:r>
+            <w:r>
+              <w:rPr>
+                <w:rFonts w:ascii="Verdana" w:eastAsia="Verdana" w:hAnsi="Verdana" w:cs="Verdana"/>
+                <w:b/>
+                <w:bCs/>
+                <w:sz w:val="24"/>
+                <w:szCs w:val="24"/>
+              </w:rPr>
+              <w:t>NOTE</w:t>
+            </w:r>
+            <w:r>
+              <w:rPr>
+                <w:rFonts w:ascii="Verdana" w:eastAsia="Verdana" w:hAnsi="Verdana" w:cs="Verdana"/>
+                <w:sz w:val="24"/>
+                <w:szCs w:val="24"/>
+              </w:rPr>
+              <w:t>: You may, but are not required to, request your agent and successor agents to provide specimen signatures below. This can help institutions and businesses verify the identity of the agent when the Power of Attorney is used later. If you include your agent’s specimen signatures in this Power of Attorney, you must also sign on the line next to the signatures of the agents.             This section is optional and can be completed at a later date.)</w:t>
+            </w:r>
+          </w:p>
+        </w:tc>
+        <w:tc>
+          <w:tcPr>
+            <w:tcW w:w="4680" w:type="dxa"/>
+            <w:tcMar>
+              <w:top w:w="100" w:type="dxa"/>
+              <w:left w:w="100" w:type="dxa"/>
+              <w:bottom w:w="100" w:type="dxa"/>
+              <w:right w:w="100" w:type="dxa"/>
+            </w:tcMar>
+          </w:tcPr>
+          <w:p>
+            <w:pPr>
+              <w:rPr>
+                <w:rFonts w:ascii="Verdana" w:eastAsia="Verdana" w:hAnsi="Verdana" w:cs="Verdana"/>
+                <w:sz w:val="24"/>
+                <w:szCs w:val="24"/>
+              </w:rPr>
+            </w:pPr>
+            <w:r>
+              <w:rPr>
+                <w:rFonts w:ascii="Verdana" w:eastAsia="Verdana" w:hAnsi="Verdana" w:cs="Verdana"/>
+                <w:i/>
+                <w:iCs/>
+                <w:sz w:val="24"/>
+                <w:szCs w:val="24"/>
+              </w:rPr>
+              <w:t>(</w:t>
+            </w:r>
+            <w:r>
+              <w:rPr>
+                <w:rFonts w:ascii="Verdana" w:eastAsia="Verdana" w:hAnsi="Verdana" w:cs="Verdana"/>
+                <w:b/>
+                <w:bCs/>
+                <w:i/>
+                <w:iCs/>
+                <w:sz w:val="24"/>
+                <w:szCs w:val="24"/>
+              </w:rPr>
+              <w:t>NOTA</w:t>
+            </w:r>
+            <w:r>
+              <w:rPr>
+                <w:rFonts w:ascii="Verdana" w:eastAsia="Verdana" w:hAnsi="Verdana" w:cs="Verdana"/>
+                <w:i/>
+                <w:iCs/>
+                <w:sz w:val="24"/>
+                <w:szCs w:val="24"/>
+              </w:rPr>
+              <w:t>: Puede, pero no está obligado, a solicitar a su agente y a los agentes sucesores que proporcionen sus firmas de muestra a continuación. Esto puede ayudar a las instituciones y empresas a verificar la identidad del agente cuando se utilice este poder notarial. Si incluye las firmas de muestra de su agente en este poder notarial, también deberá firmar en la línea junto a las firmas de los agentes. Esta sección es opcional y puede completarse posteriormente.)</w:t>
             </w:r>
           </w:p>
         </w:tc>
@@ -9367,13 +10275,6 @@
     </w:p>
     <w:p>
       <w:pPr>
-        <w:rPr>
-          <w:rFonts w:ascii="Verdana" w:eastAsia="Verdana" w:hAnsi="Verdana" w:cs="Verdana"/>
-        </w:rPr>
-      </w:pPr>
-    </w:p>
-    <w:p>
-      <w:pPr>
         <w:ind w:left="720" w:firstLine="720"/>
         <w:rPr>
           <w:rFonts w:ascii="Verdana" w:eastAsia="Verdana" w:hAnsi="Verdana" w:cs="Verdana"/>
@@ -9391,7 +10292,6 @@
         </w:rPr>
       </w:pPr>
       <w:r>
-        <w:lastRenderedPageBreak/>
         <w:br w:type="page"/>
       </w:r>
     </w:p>
@@ -9404,7 +10304,6 @@
           <w:bCs/>
           <w:sz w:val="24"/>
           <w:szCs w:val="24"/>
-          <w:u w:val="single"/>
         </w:rPr>
       </w:pPr>
       <w:r>
@@ -9414,7 +10313,6 @@
           <w:bCs/>
           <w:sz w:val="24"/>
           <w:szCs w:val="24"/>
-          <w:u w:val="single"/>
         </w:rPr>
         <w:lastRenderedPageBreak/>
         <w:t xml:space="preserve">NOTICE TO AGENT POWER OF ATTORNEY FOR PROPERTY /  </w:t>
@@ -9429,7 +10327,6 @@
           <w:bCs/>
           <w:sz w:val="24"/>
           <w:szCs w:val="24"/>
-          <w:u w:val="single"/>
         </w:rPr>
       </w:pPr>
       <w:r>
@@ -9439,7 +10336,6 @@
           <w:bCs/>
           <w:sz w:val="24"/>
           <w:szCs w:val="24"/>
-          <w:u w:val="single"/>
         </w:rPr>
         <w:t>NOTIFICACIÓN AL AGENTE PODER NOTARIAL PARA LA PROPIEDAD</w:t>
       </w:r>
@@ -10788,7 +11684,6 @@
           <w:bCs/>
           <w:sz w:val="24"/>
           <w:szCs w:val="24"/>
-          <w:u w:val="single"/>
         </w:rPr>
       </w:pPr>
       <w:r>
@@ -10798,7 +11693,6 @@
           <w:bCs/>
           <w:sz w:val="24"/>
           <w:szCs w:val="24"/>
-          <w:u w:val="single"/>
         </w:rPr>
         <w:lastRenderedPageBreak/>
         <w:t xml:space="preserve">AGENT'S CERTIFICATION AND ACCEPTANCE OF AUTHORITY / </w:t>
@@ -10813,7 +11707,6 @@
           <w:bCs/>
           <w:sz w:val="24"/>
           <w:szCs w:val="24"/>
-          <w:u w:val="single"/>
         </w:rPr>
       </w:pPr>
       <w:r>
@@ -10823,7 +11716,6 @@
           <w:bCs/>
           <w:sz w:val="24"/>
           <w:szCs w:val="24"/>
-          <w:u w:val="single"/>
         </w:rPr>
         <w:t>CERTIFICACIÓN Y ACEPTACIÓN DE AUTORIDAD DEL AGENTE</w:t>
       </w:r>
@@ -11606,39 +12498,79 @@
                 <w:sz w:val="24"/>
                 <w:szCs w:val="24"/>
               </w:rPr>
-              <w:t>*(NOTE: Perjury is defined in Section 32-2 of the Criminal Code of 2012, and is a Class 3 felony.)</w:t>
-            </w:r>
-          </w:p>
-        </w:tc>
-        <w:tc>
-          <w:tcPr>
-            <w:tcW w:w="4680" w:type="dxa"/>
-            <w:tcMar>
-              <w:top w:w="100" w:type="dxa"/>
-              <w:left w:w="100" w:type="dxa"/>
-              <w:bottom w:w="100" w:type="dxa"/>
-              <w:right w:w="100" w:type="dxa"/>
-            </w:tcMar>
-          </w:tcPr>
-          <w:p>
-            <w:pPr>
-              <w:rPr>
-                <w:rFonts w:ascii="Verdana" w:eastAsia="Verdana" w:hAnsi="Verdana" w:cs="Verdana"/>
-                <w:i/>
-                <w:iCs/>
-                <w:sz w:val="24"/>
-                <w:szCs w:val="24"/>
-              </w:rPr>
-            </w:pPr>
-            <w:r>
-              <w:rPr>
-                <w:rFonts w:ascii="Verdana" w:eastAsia="Verdana" w:hAnsi="Verdana" w:cs="Verdana"/>
-                <w:i/>
-                <w:iCs/>
-                <w:sz w:val="24"/>
-                <w:szCs w:val="24"/>
-              </w:rPr>
-              <w:t>*(AVISO: El perjurio se define en la Sección 32-2 del Código Penal de 2012 y es un delito grave de Clase 3.)*</w:t>
+              <w:t>*(</w:t>
+            </w:r>
+            <w:r>
+              <w:rPr>
+                <w:rFonts w:ascii="Verdana" w:eastAsia="Verdana" w:hAnsi="Verdana" w:cs="Verdana"/>
+                <w:b/>
+                <w:bCs/>
+                <w:sz w:val="24"/>
+                <w:szCs w:val="24"/>
+              </w:rPr>
+              <w:t>NOTE</w:t>
+            </w:r>
+            <w:r>
+              <w:rPr>
+                <w:rFonts w:ascii="Verdana" w:eastAsia="Verdana" w:hAnsi="Verdana" w:cs="Verdana"/>
+                <w:sz w:val="24"/>
+                <w:szCs w:val="24"/>
+              </w:rPr>
+              <w:t>: Perjury is defined in Section 32-2 of the Criminal Code of 2012, and is a Class 3 felony.)</w:t>
+            </w:r>
+          </w:p>
+        </w:tc>
+        <w:tc>
+          <w:tcPr>
+            <w:tcW w:w="4680" w:type="dxa"/>
+            <w:tcMar>
+              <w:top w:w="100" w:type="dxa"/>
+              <w:left w:w="100" w:type="dxa"/>
+              <w:bottom w:w="100" w:type="dxa"/>
+              <w:right w:w="100" w:type="dxa"/>
+            </w:tcMar>
+          </w:tcPr>
+          <w:p>
+            <w:pPr>
+              <w:rPr>
+                <w:rFonts w:ascii="Verdana" w:eastAsia="Verdana" w:hAnsi="Verdana" w:cs="Verdana"/>
+                <w:i/>
+                <w:iCs/>
+                <w:sz w:val="24"/>
+                <w:szCs w:val="24"/>
+              </w:rPr>
+            </w:pPr>
+            <w:r>
+              <w:rPr>
+                <w:rFonts w:ascii="Verdana" w:eastAsia="Verdana" w:hAnsi="Verdana" w:cs="Verdana"/>
+                <w:i/>
+                <w:iCs/>
+                <w:sz w:val="24"/>
+                <w:szCs w:val="24"/>
+              </w:rPr>
+              <w:t>*(</w:t>
+            </w:r>
+            <w:r>
+              <w:rPr>
+                <w:rFonts w:ascii="Verdana" w:eastAsia="Verdana" w:hAnsi="Verdana" w:cs="Verdana"/>
+                <w:b/>
+                <w:bCs/>
+                <w:i/>
+                <w:iCs/>
+                <w:sz w:val="24"/>
+                <w:szCs w:val="24"/>
+              </w:rPr>
+              <w:t>AVISO</w:t>
+            </w:r>
+            <w:r>
+              <w:rPr>
+                <w:rFonts w:ascii="Verdana" w:eastAsia="Verdana" w:hAnsi="Verdana" w:cs="Verdana"/>
+                <w:i/>
+                <w:iCs/>
+                <w:sz w:val="24"/>
+                <w:szCs w:val="24"/>
+              </w:rPr>
+              <w:t>: El perjurio se define en la Sección 32-2 del Código Penal de 2012 y es un delito grave de Clase 3.)*</w:t>
             </w:r>
           </w:p>
         </w:tc>
@@ -12167,9 +13099,19 @@
 <file path=word/footer1.xml><?xml version="1.0" encoding="utf-8"?>
 <w:ftr xmlns:wpc="http://schemas.microsoft.com/office/word/2010/wordprocessingCanvas" xmlns:cx="http://schemas.microsoft.com/office/drawing/2014/chartex" xmlns:cx1="http://schemas.microsoft.com/office/drawing/2015/9/8/chartex" xmlns:cx2="http://schemas.microsoft.com/office/drawing/2015/10/21/chartex" xmlns:cx3="http://schemas.microsoft.com/office/drawing/2016/5/9/chartex" xmlns:cx4="http://schemas.microsoft.com/office/drawing/2016/5/10/chartex" xmlns:cx5="http://schemas.microsoft.com/office/drawing/2016/5/11/chartex" xmlns:cx6="http://schemas.microsoft.com/office/drawing/2016/5/12/chartex" xmlns:cx7="http://schemas.microsoft.com/office/drawing/2016/5/13/chartex" xmlns:cx8="http://schemas.microsoft.com/office/drawing/2016/5/14/chartex" xmlns:mc="http://schemas.openxmlformats.org/markup-compatibility/2006" xmlns:aink="http://schemas.microsoft.com/office/drawing/2016/ink" xmlns:am3d="http://schemas.microsoft.com/office/drawing/2017/model3d" xmlns:o="urn:schemas-microsoft-com:office:office" xmlns:oel="http://schemas.microsoft.com/office/2019/extlst" xmlns:r="http://schemas.openxmlformats.org/officeDocument/2006/relationships" xmlns:m="http://schemas.openxmlformats.org/officeDocument/2006/math" xmlns:v="urn:schemas-microsoft-com:vml" xmlns:wp14="http://schemas.microsoft.com/office/word/2010/wordprocessingDrawing" xmlns:wp="http://schemas.openxmlformats.org/drawingml/2006/wordprocessingDrawing" xmlns:w10="urn:schemas-microsoft-com:office:word" xmlns:w="http://schemas.openxmlformats.org/wordprocessingml/2006/main" xmlns:w14="http://schemas.microsoft.com/office/word/2010/wordml" xmlns:w15="http://schemas.microsoft.com/office/word/2012/wordml" xmlns:w16cex="http://schemas.microsoft.com/office/word/2018/wordml/cex" xmlns:w16cid="http://schemas.microsoft.com/office/word/2016/wordml/cid" xmlns:w16="http://schemas.microsoft.com/office/word/2018/wordml" xmlns:w16du="http://schemas.microsoft.com/office/word/2023/wordml/word16du" xmlns:w16sdtdh="http://schemas.microsoft.com/office/word/2020/wordml/sdtdatahash" xmlns:w16sdtfl="http://schemas.microsoft.com/office/word/2024/wordml/sdtformatlock" xmlns:w16se="http://schemas.microsoft.com/office/word/2015/wordml/symex" xmlns:wpg="http://schemas.microsoft.com/office/word/2010/wordprocessingGroup" xmlns:wpi="http://schemas.microsoft.com/office/word/2010/wordprocessingInk" xmlns:wne="http://schemas.microsoft.com/office/word/2006/wordml" xmlns:wps="http://schemas.microsoft.com/office/word/2010/wordprocessingShape" mc:Ignorable="w14 w15 w16se w16cid w16 w16cex w16sdtdh w16sdtfl w16du wp14">
   <w:p>
+    <w:pPr>
+      <w:pStyle w:val="Footer"/>
+    </w:pPr>
+  </w:p>
+</w:ftr>
+</file>
+
+<file path=word/footer2.xml><?xml version="1.0" encoding="utf-8"?>
+<w:ftr xmlns:wpc="http://schemas.microsoft.com/office/word/2010/wordprocessingCanvas" xmlns:cx="http://schemas.microsoft.com/office/drawing/2014/chartex" xmlns:cx1="http://schemas.microsoft.com/office/drawing/2015/9/8/chartex" xmlns:cx2="http://schemas.microsoft.com/office/drawing/2015/10/21/chartex" xmlns:cx3="http://schemas.microsoft.com/office/drawing/2016/5/9/chartex" xmlns:cx4="http://schemas.microsoft.com/office/drawing/2016/5/10/chartex" xmlns:cx5="http://schemas.microsoft.com/office/drawing/2016/5/11/chartex" xmlns:cx6="http://schemas.microsoft.com/office/drawing/2016/5/12/chartex" xmlns:cx7="http://schemas.microsoft.com/office/drawing/2016/5/13/chartex" xmlns:cx8="http://schemas.microsoft.com/office/drawing/2016/5/14/chartex" xmlns:mc="http://schemas.openxmlformats.org/markup-compatibility/2006" xmlns:aink="http://schemas.microsoft.com/office/drawing/2016/ink" xmlns:am3d="http://schemas.microsoft.com/office/drawing/2017/model3d" xmlns:o="urn:schemas-microsoft-com:office:office" xmlns:oel="http://schemas.microsoft.com/office/2019/extlst" xmlns:r="http://schemas.openxmlformats.org/officeDocument/2006/relationships" xmlns:m="http://schemas.openxmlformats.org/officeDocument/2006/math" xmlns:v="urn:schemas-microsoft-com:vml" xmlns:wp14="http://schemas.microsoft.com/office/word/2010/wordprocessingDrawing" xmlns:wp="http://schemas.openxmlformats.org/drawingml/2006/wordprocessingDrawing" xmlns:w10="urn:schemas-microsoft-com:office:word" xmlns:w="http://schemas.openxmlformats.org/wordprocessingml/2006/main" xmlns:w14="http://schemas.microsoft.com/office/word/2010/wordml" xmlns:w15="http://schemas.microsoft.com/office/word/2012/wordml" xmlns:w16cex="http://schemas.microsoft.com/office/word/2018/wordml/cex" xmlns:w16cid="http://schemas.microsoft.com/office/word/2016/wordml/cid" xmlns:w16="http://schemas.microsoft.com/office/word/2018/wordml" xmlns:w16du="http://schemas.microsoft.com/office/word/2023/wordml/word16du" xmlns:w16sdtdh="http://schemas.microsoft.com/office/word/2020/wordml/sdtdatahash" xmlns:w16sdtfl="http://schemas.microsoft.com/office/word/2024/wordml/sdtformatlock" xmlns:w16se="http://schemas.microsoft.com/office/word/2015/wordml/symex" xmlns:wpg="http://schemas.microsoft.com/office/word/2010/wordprocessingGroup" xmlns:wpi="http://schemas.microsoft.com/office/word/2010/wordprocessingInk" xmlns:wne="http://schemas.microsoft.com/office/word/2006/wordml" xmlns:wps="http://schemas.microsoft.com/office/word/2010/wordprocessingShape" mc:Ignorable="w14 w15 w16se w16cid w16 w16cex w16sdtdh w16sdtfl w16du wp14">
+  <w:p>
     <w:r>
       <w:pict w14:anchorId="2C38744E">
-        <v:rect id="_x0000_i1025" style="width:0;height:1.5pt" o:hralign="center" o:hrstd="t" o:hr="t" fillcolor="#a0a0a0" stroked="f"/>
+        <v:rect id="_x0000_i1040" style="width:0;height:1.5pt" o:hralign="center" o:hrstd="t" o:hr="t" fillcolor="#a0a0a0" stroked="f"/>
       </w:pict>
     </w:r>
   </w:p>
@@ -12177,6 +13119,7 @@
     <w:pPr>
       <w:rPr>
         <w:rFonts w:ascii="Verdana" w:eastAsia="Verdana" w:hAnsi="Verdana" w:cs="Verdana"/>
+        <w:color w:val="000000" w:themeColor="text1"/>
         <w:sz w:val="18"/>
         <w:szCs w:val="18"/>
       </w:rPr>
@@ -12184,16 +13127,36 @@
     <w:r>
       <w:rPr>
         <w:rFonts w:ascii="Verdana" w:eastAsia="Verdana" w:hAnsi="Verdana" w:cs="Verdana"/>
+        <w:color w:val="000000" w:themeColor="text1"/>
         <w:sz w:val="18"/>
         <w:szCs w:val="18"/>
       </w:rPr>
-      <w:t xml:space="preserve">Power of Attorney for Property (Bilingual English/Spanish) | Rev. 5-2026 </w:t>
+      <w:t xml:space="preserve">Power of Attorney for Property (Bilingual English/Spanish) | Rev. </w:t>
+    </w:r>
+    <w:r>
+      <w:rPr>
+        <w:rFonts w:ascii="Verdana" w:eastAsia="Verdana" w:hAnsi="Verdana" w:cs="Verdana"/>
+        <w:color w:val="000000" w:themeColor="text1"/>
+        <w:sz w:val="18"/>
+        <w:szCs w:val="18"/>
+      </w:rPr>
+      <w:t>10</w:t>
+    </w:r>
+    <w:r>
+      <w:rPr>
+        <w:rFonts w:ascii="Verdana" w:eastAsia="Verdana" w:hAnsi="Verdana" w:cs="Verdana"/>
+        <w:color w:val="000000" w:themeColor="text1"/>
+        <w:sz w:val="18"/>
+        <w:szCs w:val="18"/>
+      </w:rPr>
+      <w:t xml:space="preserve">-2026 </w:t>
     </w:r>
   </w:p>
   <w:p>
     <w:pPr>
       <w:rPr>
         <w:rFonts w:ascii="Verdana" w:eastAsia="Verdana" w:hAnsi="Verdana" w:cs="Verdana"/>
+        <w:color w:val="000000" w:themeColor="text1"/>
         <w:sz w:val="18"/>
         <w:szCs w:val="18"/>
       </w:rPr>
@@ -12201,6 +13164,7 @@
     <w:r>
       <w:rPr>
         <w:rFonts w:ascii="Verdana" w:eastAsia="Verdana" w:hAnsi="Verdana" w:cs="Verdana"/>
+        <w:color w:val="000000" w:themeColor="text1"/>
         <w:sz w:val="18"/>
         <w:szCs w:val="18"/>
       </w:rPr>
@@ -12209,6 +13173,7 @@
     <w:r>
       <w:rPr>
         <w:rFonts w:ascii="Verdana" w:eastAsia="Verdana" w:hAnsi="Verdana" w:cs="Verdana"/>
+        <w:color w:val="000000" w:themeColor="text1"/>
         <w:sz w:val="18"/>
         <w:szCs w:val="18"/>
       </w:rPr>
@@ -12217,6 +13182,7 @@
     <w:r>
       <w:rPr>
         <w:rFonts w:ascii="Verdana" w:eastAsia="Verdana" w:hAnsi="Verdana" w:cs="Verdana"/>
+        <w:color w:val="000000" w:themeColor="text1"/>
         <w:sz w:val="18"/>
         <w:szCs w:val="18"/>
       </w:rPr>
@@ -12225,6 +13191,7 @@
     <w:r>
       <w:rPr>
         <w:rFonts w:ascii="Verdana" w:eastAsia="Verdana" w:hAnsi="Verdana" w:cs="Verdana"/>
+        <w:color w:val="000000" w:themeColor="text1"/>
         <w:sz w:val="18"/>
         <w:szCs w:val="18"/>
       </w:rPr>
@@ -12233,6 +13200,7 @@
     <w:r>
       <w:rPr>
         <w:rFonts w:ascii="Verdana" w:eastAsia="Verdana" w:hAnsi="Verdana" w:cs="Verdana"/>
+        <w:color w:val="000000" w:themeColor="text1"/>
         <w:sz w:val="18"/>
         <w:szCs w:val="18"/>
       </w:rPr>
@@ -12242,6 +13210,7 @@
     <w:r>
       <w:rPr>
         <w:rFonts w:ascii="Verdana" w:eastAsia="Verdana" w:hAnsi="Verdana" w:cs="Verdana"/>
+        <w:color w:val="000000" w:themeColor="text1"/>
         <w:sz w:val="18"/>
         <w:szCs w:val="18"/>
       </w:rPr>
@@ -12250,6 +13219,7 @@
     <w:r>
       <w:rPr>
         <w:rFonts w:ascii="Verdana" w:eastAsia="Verdana" w:hAnsi="Verdana" w:cs="Verdana"/>
+        <w:color w:val="000000" w:themeColor="text1"/>
         <w:sz w:val="18"/>
         <w:szCs w:val="18"/>
       </w:rPr>
@@ -12258,6 +13228,7 @@
     <w:r>
       <w:rPr>
         <w:rFonts w:ascii="Verdana" w:eastAsia="Verdana" w:hAnsi="Verdana" w:cs="Verdana"/>
+        <w:color w:val="000000" w:themeColor="text1"/>
         <w:sz w:val="18"/>
         <w:szCs w:val="18"/>
       </w:rPr>
@@ -12267,6 +13238,7 @@
       <w:rPr>
         <w:rFonts w:ascii="Verdana" w:eastAsia="Verdana" w:hAnsi="Verdana" w:cs="Verdana"/>
         <w:noProof/>
+        <w:color w:val="000000" w:themeColor="text1"/>
         <w:sz w:val="18"/>
         <w:szCs w:val="18"/>
       </w:rPr>
@@ -12275,6 +13247,7 @@
     <w:r>
       <w:rPr>
         <w:rFonts w:ascii="Verdana" w:eastAsia="Verdana" w:hAnsi="Verdana" w:cs="Verdana"/>
+        <w:color w:val="000000" w:themeColor="text1"/>
         <w:sz w:val="18"/>
         <w:szCs w:val="18"/>
       </w:rPr>
@@ -12283,11 +13256,67 @@
     <w:r>
       <w:rPr>
         <w:rFonts w:ascii="Verdana" w:eastAsia="Verdana" w:hAnsi="Verdana" w:cs="Verdana"/>
+        <w:color w:val="000000" w:themeColor="text1"/>
         <w:sz w:val="18"/>
         <w:szCs w:val="18"/>
       </w:rPr>
-      <w:t xml:space="preserve"> of 25</w:t>
+      <w:t xml:space="preserve"> of </w:t>
     </w:r>
+    <w:r>
+      <w:rPr>
+        <w:rFonts w:ascii="Verdana" w:hAnsi="Verdana"/>
+        <w:color w:val="000000" w:themeColor="text1"/>
+        <w:sz w:val="18"/>
+        <w:szCs w:val="18"/>
+      </w:rPr>
+      <w:fldChar w:fldCharType="begin"/>
+    </w:r>
+    <w:r>
+      <w:rPr>
+        <w:rFonts w:ascii="Verdana" w:hAnsi="Verdana"/>
+        <w:color w:val="000000" w:themeColor="text1"/>
+        <w:sz w:val="18"/>
+        <w:szCs w:val="18"/>
+      </w:rPr>
+      <w:instrText xml:space="preserve"> NUMPAGES  \* Arabic  \* MERGEFORMAT </w:instrText>
+    </w:r>
+    <w:r>
+      <w:rPr>
+        <w:rFonts w:ascii="Verdana" w:hAnsi="Verdana"/>
+        <w:color w:val="000000" w:themeColor="text1"/>
+        <w:sz w:val="18"/>
+        <w:szCs w:val="18"/>
+      </w:rPr>
+      <w:fldChar w:fldCharType="separate"/>
+    </w:r>
+    <w:r>
+      <w:rPr>
+        <w:rFonts w:ascii="Verdana" w:hAnsi="Verdana"/>
+        <w:color w:val="000000" w:themeColor="text1"/>
+        <w:sz w:val="18"/>
+        <w:szCs w:val="18"/>
+      </w:rPr>
+      <w:t>25</w:t>
+    </w:r>
+    <w:r>
+      <w:rPr>
+        <w:rFonts w:ascii="Verdana" w:hAnsi="Verdana"/>
+        <w:color w:val="000000" w:themeColor="text1"/>
+        <w:sz w:val="18"/>
+        <w:szCs w:val="18"/>
+      </w:rPr>
+      <w:fldChar w:fldCharType="end"/>
+    </w:r>
+  </w:p>
+</w:ftr>
+</file>
+
+<file path=word/footer3.xml><?xml version="1.0" encoding="utf-8"?>
+<w:ftr xmlns:wpc="http://schemas.microsoft.com/office/word/2010/wordprocessingCanvas" xmlns:cx="http://schemas.microsoft.com/office/drawing/2014/chartex" xmlns:cx1="http://schemas.microsoft.com/office/drawing/2015/9/8/chartex" xmlns:cx2="http://schemas.microsoft.com/office/drawing/2015/10/21/chartex" xmlns:cx3="http://schemas.microsoft.com/office/drawing/2016/5/9/chartex" xmlns:cx4="http://schemas.microsoft.com/office/drawing/2016/5/10/chartex" xmlns:cx5="http://schemas.microsoft.com/office/drawing/2016/5/11/chartex" xmlns:cx6="http://schemas.microsoft.com/office/drawing/2016/5/12/chartex" xmlns:cx7="http://schemas.microsoft.com/office/drawing/2016/5/13/chartex" xmlns:cx8="http://schemas.microsoft.com/office/drawing/2016/5/14/chartex" xmlns:mc="http://schemas.openxmlformats.org/markup-compatibility/2006" xmlns:aink="http://schemas.microsoft.com/office/drawing/2016/ink" xmlns:am3d="http://schemas.microsoft.com/office/drawing/2017/model3d" xmlns:o="urn:schemas-microsoft-com:office:office" xmlns:oel="http://schemas.microsoft.com/office/2019/extlst" xmlns:r="http://schemas.openxmlformats.org/officeDocument/2006/relationships" xmlns:m="http://schemas.openxmlformats.org/officeDocument/2006/math" xmlns:v="urn:schemas-microsoft-com:vml" xmlns:wp14="http://schemas.microsoft.com/office/word/2010/wordprocessingDrawing" xmlns:wp="http://schemas.openxmlformats.org/drawingml/2006/wordprocessingDrawing" xmlns:w10="urn:schemas-microsoft-com:office:word" xmlns:w="http://schemas.openxmlformats.org/wordprocessingml/2006/main" xmlns:w14="http://schemas.microsoft.com/office/word/2010/wordml" xmlns:w15="http://schemas.microsoft.com/office/word/2012/wordml" xmlns:w16cex="http://schemas.microsoft.com/office/word/2018/wordml/cex" xmlns:w16cid="http://schemas.microsoft.com/office/word/2016/wordml/cid" xmlns:w16="http://schemas.microsoft.com/office/word/2018/wordml" xmlns:w16du="http://schemas.microsoft.com/office/word/2023/wordml/word16du" xmlns:w16sdtdh="http://schemas.microsoft.com/office/word/2020/wordml/sdtdatahash" xmlns:w16sdtfl="http://schemas.microsoft.com/office/word/2024/wordml/sdtformatlock" xmlns:w16se="http://schemas.microsoft.com/office/word/2015/wordml/symex" xmlns:wpg="http://schemas.microsoft.com/office/word/2010/wordprocessingGroup" xmlns:wpi="http://schemas.microsoft.com/office/word/2010/wordprocessingInk" xmlns:wne="http://schemas.microsoft.com/office/word/2006/wordml" xmlns:wps="http://schemas.microsoft.com/office/word/2010/wordprocessingShape" mc:Ignorable="w14 w15 w16se w16cid w16 w16cex w16sdtdh w16sdtfl w16du wp14">
+  <w:p>
+    <w:pPr>
+      <w:pStyle w:val="Footer"/>
+    </w:pPr>
   </w:p>
 </w:ftr>
 </file>
@@ -12315,6 +13344,36 @@
     </w:p>
   </w:footnote>
 </w:footnotes>
+</file>
+
+<file path=word/header1.xml><?xml version="1.0" encoding="utf-8"?>
+<w:hdr xmlns:wpc="http://schemas.microsoft.com/office/word/2010/wordprocessingCanvas" xmlns:cx="http://schemas.microsoft.com/office/drawing/2014/chartex" xmlns:cx1="http://schemas.microsoft.com/office/drawing/2015/9/8/chartex" xmlns:cx2="http://schemas.microsoft.com/office/drawing/2015/10/21/chartex" xmlns:cx3="http://schemas.microsoft.com/office/drawing/2016/5/9/chartex" xmlns:cx4="http://schemas.microsoft.com/office/drawing/2016/5/10/chartex" xmlns:cx5="http://schemas.microsoft.com/office/drawing/2016/5/11/chartex" xmlns:cx6="http://schemas.microsoft.com/office/drawing/2016/5/12/chartex" xmlns:cx7="http://schemas.microsoft.com/office/drawing/2016/5/13/chartex" xmlns:cx8="http://schemas.microsoft.com/office/drawing/2016/5/14/chartex" xmlns:mc="http://schemas.openxmlformats.org/markup-compatibility/2006" xmlns:aink="http://schemas.microsoft.com/office/drawing/2016/ink" xmlns:am3d="http://schemas.microsoft.com/office/drawing/2017/model3d" xmlns:o="urn:schemas-microsoft-com:office:office" xmlns:oel="http://schemas.microsoft.com/office/2019/extlst" xmlns:r="http://schemas.openxmlformats.org/officeDocument/2006/relationships" xmlns:m="http://schemas.openxmlformats.org/officeDocument/2006/math" xmlns:v="urn:schemas-microsoft-com:vml" xmlns:wp14="http://schemas.microsoft.com/office/word/2010/wordprocessingDrawing" xmlns:wp="http://schemas.openxmlformats.org/drawingml/2006/wordprocessingDrawing" xmlns:w10="urn:schemas-microsoft-com:office:word" xmlns:w="http://schemas.openxmlformats.org/wordprocessingml/2006/main" xmlns:w14="http://schemas.microsoft.com/office/word/2010/wordml" xmlns:w15="http://schemas.microsoft.com/office/word/2012/wordml" xmlns:w16cex="http://schemas.microsoft.com/office/word/2018/wordml/cex" xmlns:w16cid="http://schemas.microsoft.com/office/word/2016/wordml/cid" xmlns:w16="http://schemas.microsoft.com/office/word/2018/wordml" xmlns:w16du="http://schemas.microsoft.com/office/word/2023/wordml/word16du" xmlns:w16sdtdh="http://schemas.microsoft.com/office/word/2020/wordml/sdtdatahash" xmlns:w16sdtfl="http://schemas.microsoft.com/office/word/2024/wordml/sdtformatlock" xmlns:w16se="http://schemas.microsoft.com/office/word/2015/wordml/symex" xmlns:wpg="http://schemas.microsoft.com/office/word/2010/wordprocessingGroup" xmlns:wpi="http://schemas.microsoft.com/office/word/2010/wordprocessingInk" xmlns:wne="http://schemas.microsoft.com/office/word/2006/wordml" xmlns:wps="http://schemas.microsoft.com/office/word/2010/wordprocessingShape" mc:Ignorable="w14 w15 w16se w16cid w16 w16cex w16sdtdh w16sdtfl w16du wp14">
+  <w:p>
+    <w:pPr>
+      <w:pStyle w:val="Header"/>
+    </w:pPr>
+  </w:p>
+</w:hdr>
+</file>
+
+<file path=word/header2.xml><?xml version="1.0" encoding="utf-8"?>
+<w:hdr xmlns:wpc="http://schemas.microsoft.com/office/word/2010/wordprocessingCanvas" xmlns:cx="http://schemas.microsoft.com/office/drawing/2014/chartex" xmlns:cx1="http://schemas.microsoft.com/office/drawing/2015/9/8/chartex" xmlns:cx2="http://schemas.microsoft.com/office/drawing/2015/10/21/chartex" xmlns:cx3="http://schemas.microsoft.com/office/drawing/2016/5/9/chartex" xmlns:cx4="http://schemas.microsoft.com/office/drawing/2016/5/10/chartex" xmlns:cx5="http://schemas.microsoft.com/office/drawing/2016/5/11/chartex" xmlns:cx6="http://schemas.microsoft.com/office/drawing/2016/5/12/chartex" xmlns:cx7="http://schemas.microsoft.com/office/drawing/2016/5/13/chartex" xmlns:cx8="http://schemas.microsoft.com/office/drawing/2016/5/14/chartex" xmlns:mc="http://schemas.openxmlformats.org/markup-compatibility/2006" xmlns:aink="http://schemas.microsoft.com/office/drawing/2016/ink" xmlns:am3d="http://schemas.microsoft.com/office/drawing/2017/model3d" xmlns:o="urn:schemas-microsoft-com:office:office" xmlns:oel="http://schemas.microsoft.com/office/2019/extlst" xmlns:r="http://schemas.openxmlformats.org/officeDocument/2006/relationships" xmlns:m="http://schemas.openxmlformats.org/officeDocument/2006/math" xmlns:v="urn:schemas-microsoft-com:vml" xmlns:wp14="http://schemas.microsoft.com/office/word/2010/wordprocessingDrawing" xmlns:wp="http://schemas.openxmlformats.org/drawingml/2006/wordprocessingDrawing" xmlns:w10="urn:schemas-microsoft-com:office:word" xmlns:w="http://schemas.openxmlformats.org/wordprocessingml/2006/main" xmlns:w14="http://schemas.microsoft.com/office/word/2010/wordml" xmlns:w15="http://schemas.microsoft.com/office/word/2012/wordml" xmlns:w16cex="http://schemas.microsoft.com/office/word/2018/wordml/cex" xmlns:w16cid="http://schemas.microsoft.com/office/word/2016/wordml/cid" xmlns:w16="http://schemas.microsoft.com/office/word/2018/wordml" xmlns:w16du="http://schemas.microsoft.com/office/word/2023/wordml/word16du" xmlns:w16sdtdh="http://schemas.microsoft.com/office/word/2020/wordml/sdtdatahash" xmlns:w16sdtfl="http://schemas.microsoft.com/office/word/2024/wordml/sdtformatlock" xmlns:w16se="http://schemas.microsoft.com/office/word/2015/wordml/symex" xmlns:wpg="http://schemas.microsoft.com/office/word/2010/wordprocessingGroup" xmlns:wpi="http://schemas.microsoft.com/office/word/2010/wordprocessingInk" xmlns:wne="http://schemas.microsoft.com/office/word/2006/wordml" xmlns:wps="http://schemas.microsoft.com/office/word/2010/wordprocessingShape" mc:Ignorable="w14 w15 w16se w16cid w16 w16cex w16sdtdh w16sdtfl w16du wp14">
+  <w:p>
+    <w:pPr>
+      <w:pStyle w:val="Header"/>
+    </w:pPr>
+  </w:p>
+</w:hdr>
+</file>
+
+<file path=word/header3.xml><?xml version="1.0" encoding="utf-8"?>
+<w:hdr xmlns:wpc="http://schemas.microsoft.com/office/word/2010/wordprocessingCanvas" xmlns:cx="http://schemas.microsoft.com/office/drawing/2014/chartex" xmlns:cx1="http://schemas.microsoft.com/office/drawing/2015/9/8/chartex" xmlns:cx2="http://schemas.microsoft.com/office/drawing/2015/10/21/chartex" xmlns:cx3="http://schemas.microsoft.com/office/drawing/2016/5/9/chartex" xmlns:cx4="http://schemas.microsoft.com/office/drawing/2016/5/10/chartex" xmlns:cx5="http://schemas.microsoft.com/office/drawing/2016/5/11/chartex" xmlns:cx6="http://schemas.microsoft.com/office/drawing/2016/5/12/chartex" xmlns:cx7="http://schemas.microsoft.com/office/drawing/2016/5/13/chartex" xmlns:cx8="http://schemas.microsoft.com/office/drawing/2016/5/14/chartex" xmlns:mc="http://schemas.openxmlformats.org/markup-compatibility/2006" xmlns:aink="http://schemas.microsoft.com/office/drawing/2016/ink" xmlns:am3d="http://schemas.microsoft.com/office/drawing/2017/model3d" xmlns:o="urn:schemas-microsoft-com:office:office" xmlns:oel="http://schemas.microsoft.com/office/2019/extlst" xmlns:r="http://schemas.openxmlformats.org/officeDocument/2006/relationships" xmlns:m="http://schemas.openxmlformats.org/officeDocument/2006/math" xmlns:v="urn:schemas-microsoft-com:vml" xmlns:wp14="http://schemas.microsoft.com/office/word/2010/wordprocessingDrawing" xmlns:wp="http://schemas.openxmlformats.org/drawingml/2006/wordprocessingDrawing" xmlns:w10="urn:schemas-microsoft-com:office:word" xmlns:w="http://schemas.openxmlformats.org/wordprocessingml/2006/main" xmlns:w14="http://schemas.microsoft.com/office/word/2010/wordml" xmlns:w15="http://schemas.microsoft.com/office/word/2012/wordml" xmlns:w16cex="http://schemas.microsoft.com/office/word/2018/wordml/cex" xmlns:w16cid="http://schemas.microsoft.com/office/word/2016/wordml/cid" xmlns:w16="http://schemas.microsoft.com/office/word/2018/wordml" xmlns:w16du="http://schemas.microsoft.com/office/word/2023/wordml/word16du" xmlns:w16sdtdh="http://schemas.microsoft.com/office/word/2020/wordml/sdtdatahash" xmlns:w16sdtfl="http://schemas.microsoft.com/office/word/2024/wordml/sdtformatlock" xmlns:w16se="http://schemas.microsoft.com/office/word/2015/wordml/symex" xmlns:wpg="http://schemas.microsoft.com/office/word/2010/wordprocessingGroup" xmlns:wpi="http://schemas.microsoft.com/office/word/2010/wordprocessingInk" xmlns:wne="http://schemas.microsoft.com/office/word/2006/wordml" xmlns:wps="http://schemas.microsoft.com/office/word/2010/wordprocessingShape" mc:Ignorable="w14 w15 w16se w16cid w16 w16cex w16sdtdh w16sdtfl w16du wp14">
+  <w:p>
+    <w:pPr>
+      <w:pStyle w:val="Header"/>
+    </w:pPr>
+  </w:p>
+</w:hdr>
 </file>
 
 <file path=word/numbering.xml><?xml version="1.0" encoding="utf-8"?>

</xml_diff>